<commit_message>
Simplify proposal agent guide
</commit_message>
<xml_diff>
--- a/Wooplix_Proposal_Agent_Guide.docx
+++ b/Wooplix_Proposal_Agent_Guide.docx
@@ -5,36 +5,28 @@
     <w:p>
       <w:pPr>
         <w:pStyle w:val="Title"/>
+        <w:spacing w:after="80"/>
       </w:pPr>
       <w:r>
-        <w:rPr>
-          <w:rFonts w:ascii="Arial" w:hAnsi="Arial"/>
-        </w:rPr>
-        <w:t>Wooplix Proposal Agent Guide</w:t>
+        <w:t>What the Wooplix Proposal Agent Does</w:t>
       </w:r>
     </w:p>
     <w:p>
       <w:pPr>
-        <w:spacing w:after="180"/>
+        <w:spacing w:after="160"/>
       </w:pPr>
       <w:r>
         <w:rPr>
           <w:rFonts w:ascii="Arial" w:hAnsi="Arial"/>
           <w:color w:val="64748B"/>
-          <w:sz w:val="24"/>
+          <w:sz w:val="22"/>
         </w:rPr>
-        <w:t>What it does, how to publish it, and how others use it</w:t>
+        <w:t>A simple guide for the people who prepare and review Wooplix proposals</w:t>
       </w:r>
     </w:p>
     <w:p>
-      <w:pPr>
-        <w:spacing w:after="180"/>
-      </w:pPr>
       <w:r>
-        <w:rPr>
-          <w:rFonts w:ascii="Arial" w:hAnsi="Arial"/>
-        </w:rPr>
-        <w:t>This guide describes the proposal agent in this project folder. The web app lets a user upload requirement documents and download a ready-to-review set of Wooplix proposal files. Generated proposals stay marked DRAFT and need a person to review them before sending.</w:t>
+        <w:t>The Wooplix Proposal Agent turns a customer’s requirements into a first draft of a Wooplix proposal. It saves time preparing the document, while leaving the final review and approval to your team.</w:t>
       </w:r>
     </w:p>
     <w:p>
@@ -42,18 +34,52 @@
         <w:pStyle w:val="Heading1"/>
       </w:pPr>
       <w:r>
-        <w:rPr>
-          <w:rFonts w:ascii="Arial" w:hAnsi="Arial"/>
-        </w:rPr>
-        <w:t>What the agent does</w:t>
+        <w:t>What you get</w:t>
       </w:r>
     </w:p>
     <w:p>
+      <w:pPr>
+        <w:pStyle w:val="ListBullet"/>
+        <w:spacing w:after="40"/>
+      </w:pPr>
       <w:r>
         <w:rPr>
-          <w:rFonts w:ascii="Arial" w:hAnsi="Arial"/>
+          <w:b/>
         </w:rPr>
-        <w:t>The agent reads a customer requirement in PDF, DOCX, TXT, or Markdown format, extracts the text, and asks the Groq language model to draft a structured scope of work in Wooplix style. If Zoho credentials are configured, it can also use CRM deals as optional precedent. It does not invent rates, effort, dates, or commitments when those details are not supplied.</w:t>
+        <w:t xml:space="preserve">An editable document — </w:t>
+      </w:r>
+      <w:r>
+        <w:t>Make changes in Word.</w:t>
+      </w:r>
+    </w:p>
+    <w:p>
+      <w:pPr>
+        <w:pStyle w:val="ListBullet"/>
+        <w:spacing w:after="40"/>
+      </w:pPr>
+      <w:r>
+        <w:rPr>
+          <w:b/>
+        </w:rPr>
+        <w:t xml:space="preserve">A PDF — </w:t>
+      </w:r>
+      <w:r>
+        <w:t>Share or print the proposal.</w:t>
+      </w:r>
+    </w:p>
+    <w:p>
+      <w:pPr>
+        <w:pStyle w:val="ListBullet"/>
+        <w:spacing w:after="40"/>
+      </w:pPr>
+      <w:r>
+        <w:rPr>
+          <w:b/>
+        </w:rPr>
+        <w:t xml:space="preserve">A data file — </w:t>
+      </w:r>
+      <w:r>
+        <w:t>A copy of the proposal details for reference.</w:t>
       </w:r>
     </w:p>
     <w:p>
@@ -61,190 +87,43 @@
         <w:pStyle w:val="Heading1"/>
       </w:pPr>
       <w:r>
-        <w:rPr>
-          <w:rFonts w:ascii="Arial" w:hAnsi="Arial"/>
-        </w:rPr>
-        <w:t>How a request becomes a proposal</w:t>
+        <w:t>How to use it</w:t>
       </w:r>
     </w:p>
-    <w:tbl>
-      <w:tblPr>
-        <w:tblW w:type="auto" w:w="0"/>
-        <w:jc w:val="center"/>
-        <w:tblLayout w:type="fixed"/>
-        <w:tblLook w:firstColumn="1" w:firstRow="1" w:lastColumn="0" w:lastRow="0" w:noHBand="0" w:noVBand="1" w:val="04A0"/>
-      </w:tblPr>
-      <w:tblGrid>
-        <w:gridCol w:w="2498"/>
-        <w:gridCol w:w="2498"/>
-        <w:gridCol w:w="2498"/>
-        <w:gridCol w:w="2498"/>
-      </w:tblGrid>
-      <w:tr>
-        <w:tc>
-          <w:tcPr>
-            <w:tcW w:type="dxa" w:w="2232"/>
-            <w:vAlign w:val="center"/>
-            <w:shd w:fill="EEF3FC"/>
-            <w:tcMar>
-              <w:top w:w="90" w:type="dxa"/>
-              <w:start w:w="110" w:type="dxa"/>
-              <w:bottom w:w="90" w:type="dxa"/>
-              <w:end w:w="110" w:type="dxa"/>
-            </w:tcMar>
-          </w:tcPr>
-          <w:p>
-            <w:pPr>
-              <w:spacing w:after="60"/>
-            </w:pPr>
-            <w:r>
-              <w:rPr>
-                <w:rFonts w:ascii="Arial" w:hAnsi="Arial"/>
-                <w:b/>
-                <w:color w:val="315FCB"/>
-                <w:sz w:val="16"/>
-              </w:rPr>
-              <w:t>01  INPUT</w:t>
-            </w:r>
-          </w:p>
-          <w:p>
-            <w:pPr>
-              <w:spacing w:after="0"/>
-            </w:pPr>
-            <w:r>
-              <w:rPr>
-                <w:rFonts w:ascii="Arial" w:hAnsi="Arial"/>
-                <w:sz w:val="17"/>
-              </w:rPr>
-              <w:t>Requirement files</w:t>
-            </w:r>
-          </w:p>
-        </w:tc>
-        <w:tc>
-          <w:tcPr>
-            <w:tcW w:type="dxa" w:w="2232"/>
-            <w:vAlign w:val="center"/>
-            <w:shd w:fill="EEF3FC"/>
-            <w:tcMar>
-              <w:top w:w="90" w:type="dxa"/>
-              <w:start w:w="110" w:type="dxa"/>
-              <w:bottom w:w="90" w:type="dxa"/>
-              <w:end w:w="110" w:type="dxa"/>
-            </w:tcMar>
-          </w:tcPr>
-          <w:p>
-            <w:pPr>
-              <w:spacing w:after="60"/>
-            </w:pPr>
-            <w:r>
-              <w:rPr>
-                <w:rFonts w:ascii="Arial" w:hAnsi="Arial"/>
-                <w:b/>
-                <w:color w:val="315FCB"/>
-                <w:sz w:val="16"/>
-              </w:rPr>
-              <w:t>02  DRAFT</w:t>
-            </w:r>
-          </w:p>
-          <w:p>
-            <w:pPr>
-              <w:spacing w:after="0"/>
-            </w:pPr>
-            <w:r>
-              <w:rPr>
-                <w:rFonts w:ascii="Arial" w:hAnsi="Arial"/>
-                <w:sz w:val="17"/>
-              </w:rPr>
-              <w:t>Groq + Wooplix prompt</w:t>
-            </w:r>
-          </w:p>
-        </w:tc>
-        <w:tc>
-          <w:tcPr>
-            <w:tcW w:type="dxa" w:w="2232"/>
-            <w:vAlign w:val="center"/>
-            <w:shd w:fill="EEF3FC"/>
-            <w:tcMar>
-              <w:top w:w="90" w:type="dxa"/>
-              <w:start w:w="110" w:type="dxa"/>
-              <w:bottom w:w="90" w:type="dxa"/>
-              <w:end w:w="110" w:type="dxa"/>
-            </w:tcMar>
-          </w:tcPr>
-          <w:p>
-            <w:pPr>
-              <w:spacing w:after="60"/>
-            </w:pPr>
-            <w:r>
-              <w:rPr>
-                <w:rFonts w:ascii="Arial" w:hAnsi="Arial"/>
-                <w:b/>
-                <w:color w:val="315FCB"/>
-                <w:sz w:val="16"/>
-              </w:rPr>
-              <w:t>03  FORMAT</w:t>
-            </w:r>
-          </w:p>
-          <w:p>
-            <w:pPr>
-              <w:spacing w:after="0"/>
-            </w:pPr>
-            <w:r>
-              <w:rPr>
-                <w:rFonts w:ascii="Arial" w:hAnsi="Arial"/>
-                <w:sz w:val="17"/>
-              </w:rPr>
-              <w:t>Existing DOCX + Dompdf builders</w:t>
-            </w:r>
-          </w:p>
-        </w:tc>
-        <w:tc>
-          <w:tcPr>
-            <w:tcW w:type="dxa" w:w="2232"/>
-            <w:vAlign w:val="center"/>
-            <w:shd w:fill="EEF3FC"/>
-            <w:tcMar>
-              <w:top w:w="90" w:type="dxa"/>
-              <w:start w:w="110" w:type="dxa"/>
-              <w:bottom w:w="90" w:type="dxa"/>
-              <w:end w:w="110" w:type="dxa"/>
-            </w:tcMar>
-          </w:tcPr>
-          <w:p>
-            <w:pPr>
-              <w:spacing w:after="60"/>
-            </w:pPr>
-            <w:r>
-              <w:rPr>
-                <w:rFonts w:ascii="Arial" w:hAnsi="Arial"/>
-                <w:b/>
-                <w:color w:val="315FCB"/>
-                <w:sz w:val="16"/>
-              </w:rPr>
-              <w:t>04  DOWNLOAD</w:t>
-            </w:r>
-          </w:p>
-          <w:p>
-            <w:pPr>
-              <w:spacing w:after="0"/>
-            </w:pPr>
-            <w:r>
-              <w:rPr>
-                <w:rFonts w:ascii="Arial" w:hAnsi="Arial"/>
-                <w:sz w:val="17"/>
-              </w:rPr>
-              <w:t>DOCX, PDF, JSON in a ZIP</w:t>
-            </w:r>
-          </w:p>
-        </w:tc>
-      </w:tr>
-    </w:tbl>
     <w:p>
+      <w:pPr>
+        <w:pStyle w:val="ListNumber"/>
+        <w:spacing w:after="60"/>
+      </w:pPr>
       <w:r>
-        <w:rPr>
-          <w:rFonts w:ascii="Arial" w:hAnsi="Arial"/>
-        </w:rPr>
-        <w:t>The web flow calls the project’s existing proposal functions, including the DOCX builder and the same HTML/Dompdf PDF template used by the command-line agent.</w:t>
+        <w:t>Open the proposal app using the link provided by your team.</w:t>
+      </w:r>
+    </w:p>
+    <w:p>
+      <w:pPr>
+        <w:pStyle w:val="ListNumber"/>
+        <w:spacing w:after="60"/>
+      </w:pPr>
+      <w:r>
+        <w:t>Choose a folder or select up to five requirement files. PDF, Word, text, and Markdown files are supported.</w:t>
+      </w:r>
+    </w:p>
+    <w:p>
+      <w:pPr>
+        <w:pStyle w:val="ListNumber"/>
+        <w:spacing w:after="60"/>
+      </w:pPr>
+      <w:r>
+        <w:t>Select Generate proposals and wait for the download.</w:t>
+      </w:r>
+    </w:p>
+    <w:p>
+      <w:pPr>
+        <w:pStyle w:val="ListNumber"/>
+        <w:spacing w:after="60"/>
+      </w:pPr>
+      <w:r>
+        <w:t>Open the downloaded ZIP folder. Review each proposal and make any needed changes before sharing it.</w:t>
       </w:r>
     </w:p>
     <w:p>
@@ -252,57 +131,15 @@
         <w:pStyle w:val="Heading1"/>
       </w:pPr>
       <w:r>
-        <w:rPr>
-          <w:rFonts w:ascii="Arial" w:hAnsi="Arial"/>
-        </w:rPr>
-        <w:t>What users receive</w:t>
+        <w:t>How it becomes available online</w:t>
       </w:r>
     </w:p>
     <w:p>
       <w:pPr>
-        <w:pStyle w:val="ListBullet"/>
-        <w:spacing w:after="60"/>
-        <w:ind w:left="317" w:hanging="216"/>
+        <w:spacing w:after="120"/>
       </w:pPr>
       <w:r>
-        <w:rPr>
-          <w:rFonts w:ascii="Arial" w:hAnsi="Arial"/>
-        </w:rPr>
-        <w:t>DOCX: an editable branded proposal.</w:t>
-      </w:r>
-    </w:p>
-    <w:p>
-      <w:pPr>
-        <w:pStyle w:val="ListBullet"/>
-        <w:spacing w:after="60"/>
-        <w:ind w:left="317" w:hanging="216"/>
-      </w:pPr>
-      <w:r>
-        <w:rPr>
-          <w:rFonts w:ascii="Arial" w:hAnsi="Arial"/>
-        </w:rPr>
-        <w:t>PDF: a shareable copy rendered with Dompdf.</w:t>
-      </w:r>
-    </w:p>
-    <w:p>
-      <w:pPr>
-        <w:pStyle w:val="ListBullet"/>
-        <w:spacing w:after="60"/>
-        <w:ind w:left="317" w:hanging="216"/>
-      </w:pPr>
-      <w:r>
-        <w:rPr>
-          <w:rFonts w:ascii="Arial" w:hAnsi="Arial"/>
-        </w:rPr>
-        <w:t>JSON: the structured proposal data.</w:t>
-      </w:r>
-    </w:p>
-    <w:p>
-      <w:r>
-        <w:rPr>
-          <w:rFonts w:ascii="Arial" w:hAnsi="Arial"/>
-        </w:rPr>
-        <w:t>The web app places the files in a Wooplix_Results folder inside a ZIP download. The files are temporary during generation; the app does not save uploaded requirements or results as a permanent project library.</w:t>
+        <w:t>The project owner puts the app on GitHub, connects it to Vercel, and adds the private key the app needs to create proposals. Vercel then publishes the app and provides a web link. The owner can share that link with the intended users.</w:t>
       </w:r>
     </w:p>
     <w:p>
@@ -310,229 +147,41 @@
         <w:pStyle w:val="Heading1"/>
       </w:pPr>
       <w:r>
-        <w:rPr>
-          <w:rFonts w:ascii="Arial" w:hAnsi="Arial"/>
-        </w:rPr>
-        <w:t>Run it locally</w:t>
-      </w:r>
-    </w:p>
-    <w:p>
-      <w:r>
-        <w:rPr>
-          <w:rFonts w:ascii="Arial" w:hAnsi="Arial"/>
-        </w:rPr>
-        <w:t>For a command-line run, install the Python packages in requirements.txt, install PHP and the Dompdf dependency with Composer, set GROQ_API_KEY in the environment, then run:</w:t>
-      </w:r>
-    </w:p>
-    <w:p>
-      <w:pPr>
-        <w:spacing w:before="20" w:after="120"/>
-        <w:ind w:left="259"/>
-      </w:pPr>
-      <w:r>
-        <w:rPr>
-          <w:rFonts w:ascii="Arial" w:hAnsi="Arial"/>
-          <w:color w:val="172B4D"/>
-          <w:sz w:val="18"/>
-        </w:rPr>
-        <w:t>python3 wooplix_agent.py requirement.pdf --out ./out</w:t>
-      </w:r>
-    </w:p>
-    <w:p>
-      <w:pPr>
-        <w:pageBreakBefore/>
-      </w:pPr>
-    </w:p>
-    <w:p>
-      <w:pPr>
-        <w:pStyle w:val="Heading1"/>
-      </w:pPr>
-      <w:r>
-        <w:rPr>
-          <w:rFonts w:ascii="Arial" w:hAnsi="Arial"/>
-        </w:rPr>
-        <w:t>Publish the web app on Vercel</w:t>
-      </w:r>
-    </w:p>
-    <w:p>
-      <w:r>
-        <w:rPr>
-          <w:rFonts w:ascii="Arial" w:hAnsi="Arial"/>
-        </w:rPr>
-        <w:t>The GitHub repository is the source Vercel deploys. Connect the repository to Vercel once the main branch has been pushed, add the server-side environment variables, and deploy the repository root.</w:t>
-      </w:r>
-    </w:p>
-    <w:p>
-      <w:pPr>
-        <w:pStyle w:val="Heading2"/>
-      </w:pPr>
-      <w:r>
-        <w:rPr>
-          <w:rFonts w:ascii="Arial" w:hAnsi="Arial"/>
-        </w:rPr>
-        <w:t>Deployment checklist</w:t>
+        <w:t>A few things to remember</w:t>
       </w:r>
     </w:p>
     <w:p>
       <w:pPr>
         <w:pStyle w:val="ListBullet"/>
-        <w:spacing w:after="60"/>
-        <w:ind w:left="317" w:hanging="216"/>
+        <w:spacing w:after="40"/>
       </w:pPr>
       <w:r>
-        <w:rPr>
-          <w:rFonts w:ascii="Arial" w:hAnsi="Arial"/>
-        </w:rPr>
-        <w:t>Push the local main branch to https://github.com/wooplix15-debug/proposal.git. The local commit is ready; the first push needs GitHub authentication on the computer.</w:t>
+        <w:t>Every proposal is a draft. Check names, details, scope, and commitments before sending it.</w:t>
       </w:r>
     </w:p>
     <w:p>
       <w:pPr>
         <w:pStyle w:val="ListBullet"/>
-        <w:spacing w:after="60"/>
-        <w:ind w:left="317" w:hanging="216"/>
+        <w:spacing w:after="40"/>
       </w:pPr>
       <w:r>
-        <w:rPr>
-          <w:rFonts w:ascii="Arial" w:hAnsi="Arial"/>
-        </w:rPr>
-        <w:t>In Vercel, import wooplix15-debug/proposal and keep the project root as the deployment directory.</w:t>
+        <w:t>The requirements are sent to an AI service to prepare the draft. The app does not keep the uploaded files after processing.</w:t>
       </w:r>
     </w:p>
     <w:p>
       <w:pPr>
         <w:pStyle w:val="ListBullet"/>
-        <w:spacing w:after="60"/>
-        <w:ind w:left="317" w:hanging="216"/>
+        <w:spacing w:after="40"/>
       </w:pPr>
       <w:r>
-        <w:rPr>
-          <w:rFonts w:ascii="Arial" w:hAnsi="Arial"/>
-        </w:rPr>
-        <w:t>Add GROQ_API_KEY and PDF_RENDER_TOKEN in Vercel Project Settings. PDF_RENDER_TOKEN must be a long random secret; both server functions read the same value.</w:t>
-      </w:r>
-    </w:p>
-    <w:p>
-      <w:pPr>
-        <w:pStyle w:val="ListBullet"/>
-        <w:spacing w:after="60"/>
-        <w:ind w:left="317" w:hanging="216"/>
-      </w:pPr>
-      <w:r>
-        <w:rPr>
-          <w:rFonts w:ascii="Arial" w:hAnsi="Arial"/>
-        </w:rPr>
-        <w:t>Optionally add GROQ_MODEL and the Zoho CRM variables ZOHO_CLIENT_ID, ZOHO_CLIENT_SECRET, and ZOHO_REFRESH_TOKEN.</w:t>
-      </w:r>
-    </w:p>
-    <w:p>
-      <w:pPr>
-        <w:pStyle w:val="ListBullet"/>
-        <w:spacing w:after="60"/>
-        <w:ind w:left="317" w:hanging="216"/>
-      </w:pPr>
-      <w:r>
-        <w:rPr>
-          <w:rFonts w:ascii="Arial" w:hAnsi="Arial"/>
-        </w:rPr>
-        <w:t>Deploy and open the Vercel project URL. Set the environment variables for each environment you plan to use, then redeploy after changing them.</w:t>
-      </w:r>
-    </w:p>
-    <w:p>
-      <w:r>
-        <w:rPr>
-          <w:rFonts w:ascii="Arial" w:hAnsi="Arial"/>
-        </w:rPr>
-        <w:t>The Python API creates drafts and ZIP files. The PHP function uses the Vercel PHP community runtime and Composer to run the existing Dompdf renderer. Keep all API keys in Vercel settings; never add real secrets to the repository or browser code.</w:t>
-      </w:r>
-    </w:p>
-    <w:p>
-      <w:pPr>
-        <w:pStyle w:val="Heading1"/>
-      </w:pPr>
-      <w:r>
-        <w:rPr>
-          <w:rFonts w:ascii="Arial" w:hAnsi="Arial"/>
-        </w:rPr>
-        <w:t>How another person uses it</w:t>
-      </w:r>
-    </w:p>
-    <w:p>
-      <w:pPr>
-        <w:pStyle w:val="ListBullet"/>
-        <w:spacing w:after="60"/>
-        <w:ind w:left="317" w:hanging="216"/>
-      </w:pPr>
-      <w:r>
-        <w:rPr>
-          <w:rFonts w:ascii="Arial" w:hAnsi="Arial"/>
-        </w:rPr>
-        <w:t>Open the Vercel app URL.</w:t>
-      </w:r>
-    </w:p>
-    <w:p>
-      <w:pPr>
-        <w:pStyle w:val="ListBullet"/>
-        <w:spacing w:after="60"/>
-        <w:ind w:left="317" w:hanging="216"/>
-      </w:pPr>
-      <w:r>
-        <w:rPr>
-          <w:rFonts w:ascii="Arial" w:hAnsi="Arial"/>
-        </w:rPr>
-        <w:t>Choose a folder or select up to five requirement files. Supported types are PDF, DOCX, TXT, and MD. Each file can be up to 4 MB; a batch can be up to 15 MB.</w:t>
-      </w:r>
-    </w:p>
-    <w:p>
-      <w:pPr>
-        <w:pStyle w:val="ListBullet"/>
-        <w:spacing w:after="60"/>
-        <w:ind w:left="317" w:hanging="216"/>
-      </w:pPr>
-      <w:r>
-        <w:rPr>
-          <w:rFonts w:ascii="Arial" w:hAnsi="Arial"/>
-        </w:rPr>
-        <w:t>Select Generate proposals and wait for the ZIP download. Generation can take a few minutes.</w:t>
-      </w:r>
-    </w:p>
-    <w:p>
-      <w:pPr>
-        <w:pStyle w:val="ListBullet"/>
-        <w:spacing w:after="60"/>
-        <w:ind w:left="317" w:hanging="216"/>
-      </w:pPr>
-      <w:r>
-        <w:rPr>
-          <w:rFonts w:ascii="Arial" w:hAnsi="Arial"/>
-        </w:rPr>
-        <w:t>Extract Wooplix_Results.zip, review the DOCX/PDF/JSON for each requirement, and approve the proposal internally before sharing it.</w:t>
-      </w:r>
-    </w:p>
-    <w:p>
-      <w:pPr>
-        <w:pStyle w:val="Heading2"/>
-      </w:pPr>
-      <w:r>
-        <w:rPr>
-          <w:rFonts w:ascii="Arial" w:hAnsi="Arial"/>
-        </w:rPr>
-        <w:t>Access and data handling</w:t>
-      </w:r>
-    </w:p>
-    <w:p>
-      <w:r>
-        <w:rPr>
-          <w:rFonts w:ascii="Arial" w:hAnsi="Arial"/>
-        </w:rPr>
-        <w:t>The current upload page has no sign-in gate, so anyone with its URL can submit a request and use the configured Groq service. Share the URL only with intended users. Requirement text is sent to Groq for drafting; when Zoho is configured, CRM precedent is also retrieved. Uploads and results are processed in temporary function storage and are not retained by this app after the request completes.</w:t>
+        <w:t>Anyone with the app link can use it, so share the link only with the people who should have access.</w:t>
       </w:r>
     </w:p>
     <w:sectPr>
       <w:headerReference w:type="default" r:id="rId9"/>
       <w:footerReference w:type="default" r:id="rId10"/>
       <w:pgSz w:w="12240" w:h="15840"/>
-      <w:pgMar w:top="893" w:right="1123" w:bottom="893" w:left="1123" w:header="720" w:footer="720" w:gutter="0"/>
+      <w:pgMar w:top="893" w:right="1152" w:bottom="835" w:left="1152" w:header="720" w:footer="720" w:gutter="0"/>
       <w:cols w:space="720"/>
       <w:docGrid w:linePitch="360"/>
     </w:sectPr>
@@ -549,12 +198,12 @@
     </w:pPr>
     <w:r>
       <w:rPr>
+        <w:rFonts w:ascii="Arial" w:hAnsi="Arial"/>
         <w:color w:val="64748B"/>
         <w:sz w:val="16"/>
       </w:rPr>
-      <w:t xml:space="preserve">Wooplix Technologies Private Limited  •  </w:t>
+      <w:t>Wooplix Technologies Private Limited</w:t>
     </w:r>
-    <w:fldSimple w:instr="PAGE"/>
   </w:p>
 </w:ftr>
 </file>
@@ -568,7 +217,7 @@
     </w:pPr>
     <w:r>
       <w:rPr>
-        <w:rFonts w:ascii="Aptos" w:hAnsi="Aptos"/>
+        <w:rFonts w:ascii="Arial" w:hAnsi="Arial"/>
         <w:b/>
         <w:color w:val="315FCB"/>
         <w:sz w:val="16"/>
@@ -943,12 +592,12 @@
     <w:qFormat/>
     <w:rsid w:val="00FC693F"/>
     <w:pPr>
-      <w:spacing w:after="100" w:line="259" w:lineRule="auto"/>
+      <w:spacing w:after="100" w:line="254" w:lineRule="auto"/>
     </w:pPr>
     <w:rPr>
       <w:rFonts w:ascii="Arial" w:hAnsi="Arial"/>
       <w:color w:val="26364B"/>
-      <w:sz w:val="20"/>
+      <w:sz w:val="21"/>
     </w:rPr>
   </w:style>
   <w:style w:type="paragraph" w:styleId="Header">
@@ -965,9 +614,6 @@
       </w:tabs>
       <w:spacing w:after="0" w:line="240" w:lineRule="auto"/>
     </w:pPr>
-    <w:rPr>
-      <w:rFonts w:ascii="Arial" w:hAnsi="Arial"/>
-    </w:rPr>
   </w:style>
   <w:style w:type="character" w:customStyle="1" w:styleId="HeaderChar">
     <w:name w:val="Header Char"/>
@@ -975,9 +621,6 @@
     <w:link w:val="Header"/>
     <w:uiPriority w:val="99"/>
     <w:rsid w:val="00E618BF"/>
-    <w:rPr>
-      <w:rFonts w:ascii="Arial" w:hAnsi="Arial"/>
-    </w:rPr>
   </w:style>
   <w:style w:type="paragraph" w:styleId="Footer">
     <w:name w:val="footer"/>
@@ -993,9 +636,6 @@
       </w:tabs>
       <w:spacing w:after="0" w:line="240" w:lineRule="auto"/>
     </w:pPr>
-    <w:rPr>
-      <w:rFonts w:ascii="Arial" w:hAnsi="Arial"/>
-    </w:rPr>
   </w:style>
   <w:style w:type="character" w:customStyle="1" w:styleId="FooterChar">
     <w:name w:val="Footer Char"/>
@@ -1003,9 +643,6 @@
     <w:link w:val="Footer"/>
     <w:uiPriority w:val="99"/>
     <w:rsid w:val="00E618BF"/>
-    <w:rPr>
-      <w:rFonts w:ascii="Arial" w:hAnsi="Arial"/>
-    </w:rPr>
   </w:style>
   <w:style w:type="paragraph" w:styleId="Heading1">
     <w:name w:val="heading 1"/>
@@ -1018,7 +655,7 @@
     <w:pPr>
       <w:keepNext/>
       <w:keepLines/>
-      <w:spacing w:before="200" w:after="80"/>
+      <w:spacing w:before="160" w:after="60"/>
       <w:outlineLvl w:val="0"/>
     </w:pPr>
     <w:rPr>
@@ -1026,7 +663,7 @@
       <w:b/>
       <w:bCs/>
       <w:color w:val="172B4D"/>
-      <w:sz w:val="34"/>
+      <w:sz w:val="28"/>
       <w:szCs w:val="28"/>
     </w:rPr>
   </w:style>
@@ -1042,7 +679,7 @@
     <w:pPr>
       <w:keepNext/>
       <w:keepLines/>
-      <w:spacing w:before="200" w:after="80"/>
+      <w:spacing w:before="160" w:after="60"/>
       <w:outlineLvl w:val="1"/>
     </w:pPr>
     <w:rPr>
@@ -1050,7 +687,7 @@
       <w:b/>
       <w:bCs/>
       <w:color w:val="315FCB"/>
-      <w:sz w:val="24"/>
+      <w:sz w:val="22"/>
       <w:szCs w:val="26"/>
     </w:rPr>
   </w:style>
@@ -1070,7 +707,7 @@
       <w:outlineLvl w:val="2"/>
     </w:pPr>
     <w:rPr>
-      <w:rFonts w:asciiTheme="majorHAnsi" w:eastAsiaTheme="majorEastAsia" w:hAnsiTheme="majorHAnsi" w:cstheme="majorBidi" w:ascii="Arial" w:hAnsi="Arial"/>
+      <w:rFonts w:asciiTheme="majorHAnsi" w:eastAsiaTheme="majorEastAsia" w:hAnsiTheme="majorHAnsi" w:cstheme="majorBidi"/>
       <w:b/>
       <w:bCs/>
       <w:color w:val="4F81BD" w:themeColor="accent1"/>
@@ -1093,7 +730,7 @@
       <w:outlineLvl w:val="3"/>
     </w:pPr>
     <w:rPr>
-      <w:rFonts w:asciiTheme="majorHAnsi" w:eastAsiaTheme="majorEastAsia" w:hAnsiTheme="majorHAnsi" w:cstheme="majorBidi" w:ascii="Arial" w:hAnsi="Arial"/>
+      <w:rFonts w:asciiTheme="majorHAnsi" w:eastAsiaTheme="majorEastAsia" w:hAnsiTheme="majorHAnsi" w:cstheme="majorBidi"/>
       <w:b/>
       <w:bCs/>
       <w:i/>
@@ -1118,7 +755,7 @@
       <w:outlineLvl w:val="4"/>
     </w:pPr>
     <w:rPr>
-      <w:rFonts w:asciiTheme="majorHAnsi" w:eastAsiaTheme="majorEastAsia" w:hAnsiTheme="majorHAnsi" w:cstheme="majorBidi" w:ascii="Arial" w:hAnsi="Arial"/>
+      <w:rFonts w:asciiTheme="majorHAnsi" w:eastAsiaTheme="majorEastAsia" w:hAnsiTheme="majorHAnsi" w:cstheme="majorBidi"/>
       <w:color w:val="243F60" w:themeColor="accent1" w:themeShade="7F"/>
     </w:rPr>
   </w:style>
@@ -1139,7 +776,7 @@
       <w:outlineLvl w:val="5"/>
     </w:pPr>
     <w:rPr>
-      <w:rFonts w:asciiTheme="majorHAnsi" w:eastAsiaTheme="majorEastAsia" w:hAnsiTheme="majorHAnsi" w:cstheme="majorBidi" w:ascii="Arial" w:hAnsi="Arial"/>
+      <w:rFonts w:asciiTheme="majorHAnsi" w:eastAsiaTheme="majorEastAsia" w:hAnsiTheme="majorHAnsi" w:cstheme="majorBidi"/>
       <w:i/>
       <w:iCs/>
       <w:color w:val="243F60" w:themeColor="accent1" w:themeShade="7F"/>
@@ -1162,7 +799,7 @@
       <w:outlineLvl w:val="6"/>
     </w:pPr>
     <w:rPr>
-      <w:rFonts w:asciiTheme="majorHAnsi" w:eastAsiaTheme="majorEastAsia" w:hAnsiTheme="majorHAnsi" w:cstheme="majorBidi" w:ascii="Arial" w:hAnsi="Arial"/>
+      <w:rFonts w:asciiTheme="majorHAnsi" w:eastAsiaTheme="majorEastAsia" w:hAnsiTheme="majorHAnsi" w:cstheme="majorBidi"/>
       <w:i/>
       <w:iCs/>
       <w:color w:val="404040" w:themeColor="text1" w:themeTint="BF"/>
@@ -1185,7 +822,7 @@
       <w:outlineLvl w:val="7"/>
     </w:pPr>
     <w:rPr>
-      <w:rFonts w:asciiTheme="majorHAnsi" w:eastAsiaTheme="majorEastAsia" w:hAnsiTheme="majorHAnsi" w:cstheme="majorBidi" w:ascii="Arial" w:hAnsi="Arial"/>
+      <w:rFonts w:asciiTheme="majorHAnsi" w:eastAsiaTheme="majorEastAsia" w:hAnsiTheme="majorHAnsi" w:cstheme="majorBidi"/>
       <w:color w:val="4F81BD" w:themeColor="accent1"/>
       <w:sz w:val="20"/>
       <w:szCs w:val="20"/>
@@ -1208,7 +845,7 @@
       <w:outlineLvl w:val="8"/>
     </w:pPr>
     <w:rPr>
-      <w:rFonts w:asciiTheme="majorHAnsi" w:eastAsiaTheme="majorEastAsia" w:hAnsiTheme="majorHAnsi" w:cstheme="majorBidi" w:ascii="Arial" w:hAnsi="Arial"/>
+      <w:rFonts w:asciiTheme="majorHAnsi" w:eastAsiaTheme="majorEastAsia" w:hAnsiTheme="majorHAnsi" w:cstheme="majorBidi"/>
       <w:i/>
       <w:iCs/>
       <w:color w:val="404040" w:themeColor="text1" w:themeTint="BF"/>
@@ -1221,18 +858,12 @@
     <w:uiPriority w:val="1"/>
     <w:semiHidden/>
     <w:unhideWhenUsed/>
-    <w:rPr>
-      <w:rFonts w:ascii="Arial" w:hAnsi="Arial"/>
-    </w:rPr>
   </w:style>
   <w:style w:type="table" w:default="1" w:styleId="TableNormal">
     <w:name w:val="Normal Table"/>
     <w:uiPriority w:val="99"/>
     <w:semiHidden/>
     <w:unhideWhenUsed/>
-    <w:rPr>
-      <w:rFonts w:ascii="Arial" w:hAnsi="Arial"/>
-    </w:rPr>
     <w:tblPr>
       <w:tblInd w:w="0" w:type="dxa"/>
       <w:tblCellMar>
@@ -1257,9 +888,6 @@
     <w:pPr>
       <w:spacing w:after="0" w:line="240" w:lineRule="auto"/>
     </w:pPr>
-    <w:rPr>
-      <w:rFonts w:ascii="Arial" w:hAnsi="Arial"/>
-    </w:rPr>
   </w:style>
   <w:style w:type="character" w:customStyle="1" w:styleId="Heading1Char">
     <w:name w:val="Heading 1 Char"/>
@@ -1268,7 +896,7 @@
     <w:uiPriority w:val="9"/>
     <w:rsid w:val="00FC693F"/>
     <w:rPr>
-      <w:rFonts w:asciiTheme="majorHAnsi" w:eastAsiaTheme="majorEastAsia" w:hAnsiTheme="majorHAnsi" w:cstheme="majorBidi" w:ascii="Arial" w:hAnsi="Arial"/>
+      <w:rFonts w:asciiTheme="majorHAnsi" w:eastAsiaTheme="majorEastAsia" w:hAnsiTheme="majorHAnsi" w:cstheme="majorBidi"/>
       <w:b/>
       <w:bCs/>
       <w:color w:val="365F91" w:themeColor="accent1" w:themeShade="BF"/>
@@ -1283,7 +911,7 @@
     <w:uiPriority w:val="9"/>
     <w:rsid w:val="00FC693F"/>
     <w:rPr>
-      <w:rFonts w:asciiTheme="majorHAnsi" w:eastAsiaTheme="majorEastAsia" w:hAnsiTheme="majorHAnsi" w:cstheme="majorBidi" w:ascii="Arial" w:hAnsi="Arial"/>
+      <w:rFonts w:asciiTheme="majorHAnsi" w:eastAsiaTheme="majorEastAsia" w:hAnsiTheme="majorHAnsi" w:cstheme="majorBidi"/>
       <w:b/>
       <w:bCs/>
       <w:color w:val="4F81BD" w:themeColor="accent1"/>
@@ -1298,7 +926,7 @@
     <w:uiPriority w:val="9"/>
     <w:rsid w:val="00FC693F"/>
     <w:rPr>
-      <w:rFonts w:asciiTheme="majorHAnsi" w:eastAsiaTheme="majorEastAsia" w:hAnsiTheme="majorHAnsi" w:cstheme="majorBidi" w:ascii="Arial" w:hAnsi="Arial"/>
+      <w:rFonts w:asciiTheme="majorHAnsi" w:eastAsiaTheme="majorEastAsia" w:hAnsiTheme="majorHAnsi" w:cstheme="majorBidi"/>
       <w:b/>
       <w:bCs/>
       <w:color w:val="4F81BD" w:themeColor="accent1"/>
@@ -1313,7 +941,7 @@
     <w:qFormat/>
     <w:rsid w:val="00FC693F"/>
     <w:pPr>
-      <w:spacing w:after="80" w:line="240" w:lineRule="auto" w:before="0"/>
+      <w:spacing w:after="60" w:line="240" w:lineRule="auto" w:before="160"/>
       <w:contextualSpacing/>
     </w:pPr>
     <w:rPr>
@@ -1322,7 +950,7 @@
       <w:color w:val="172B4D"/>
       <w:spacing w:val="5"/>
       <w:kern w:val="28"/>
-      <w:sz w:val="54"/>
+      <w:sz w:val="50"/>
       <w:szCs w:val="52"/>
     </w:rPr>
   </w:style>
@@ -1333,7 +961,7 @@
     <w:uiPriority w:val="10"/>
     <w:rsid w:val="00FC693F"/>
     <w:rPr>
-      <w:rFonts w:asciiTheme="majorHAnsi" w:eastAsiaTheme="majorEastAsia" w:hAnsiTheme="majorHAnsi" w:cstheme="majorBidi" w:ascii="Arial" w:hAnsi="Arial"/>
+      <w:rFonts w:asciiTheme="majorHAnsi" w:eastAsiaTheme="majorEastAsia" w:hAnsiTheme="majorHAnsi" w:cstheme="majorBidi"/>
       <w:color w:val="17365D" w:themeColor="text2" w:themeShade="BF"/>
       <w:spacing w:val="5"/>
       <w:kern w:val="28"/>
@@ -1355,7 +983,7 @@
       </w:numPr>
     </w:pPr>
     <w:rPr>
-      <w:rFonts w:asciiTheme="majorHAnsi" w:eastAsiaTheme="majorEastAsia" w:hAnsiTheme="majorHAnsi" w:cstheme="majorBidi" w:ascii="Arial" w:hAnsi="Arial"/>
+      <w:rFonts w:asciiTheme="majorHAnsi" w:eastAsiaTheme="majorEastAsia" w:hAnsiTheme="majorHAnsi" w:cstheme="majorBidi"/>
       <w:i/>
       <w:iCs/>
       <w:color w:val="4F81BD" w:themeColor="accent1"/>
@@ -1371,7 +999,7 @@
     <w:uiPriority w:val="11"/>
     <w:rsid w:val="00FC693F"/>
     <w:rPr>
-      <w:rFonts w:asciiTheme="majorHAnsi" w:eastAsiaTheme="majorEastAsia" w:hAnsiTheme="majorHAnsi" w:cstheme="majorBidi" w:ascii="Arial" w:hAnsi="Arial"/>
+      <w:rFonts w:asciiTheme="majorHAnsi" w:eastAsiaTheme="majorEastAsia" w:hAnsiTheme="majorHAnsi" w:cstheme="majorBidi"/>
       <w:i/>
       <w:iCs/>
       <w:color w:val="4F81BD" w:themeColor="accent1"/>
@@ -1390,9 +1018,6 @@
       <w:ind w:left="720"/>
       <w:contextualSpacing/>
     </w:pPr>
-    <w:rPr>
-      <w:rFonts w:ascii="Arial" w:hAnsi="Arial"/>
-    </w:rPr>
   </w:style>
   <w:style w:type="paragraph" w:styleId="BodyText">
     <w:name w:val="Body Text"/>
@@ -1404,9 +1029,6 @@
     <w:pPr>
       <w:spacing w:after="120"/>
     </w:pPr>
-    <w:rPr>
-      <w:rFonts w:ascii="Arial" w:hAnsi="Arial"/>
-    </w:rPr>
   </w:style>
   <w:style w:type="character" w:customStyle="1" w:styleId="BodyTextChar">
     <w:name w:val="Body Text Char"/>
@@ -1414,9 +1036,6 @@
     <w:link w:val="BodyText"/>
     <w:uiPriority w:val="99"/>
     <w:rsid w:val="00AA1D8D"/>
-    <w:rPr>
-      <w:rFonts w:ascii="Arial" w:hAnsi="Arial"/>
-    </w:rPr>
   </w:style>
   <w:style w:type="paragraph" w:styleId="BodyText2">
     <w:name w:val="Body Text 2"/>
@@ -1428,9 +1047,6 @@
     <w:pPr>
       <w:spacing w:after="120" w:line="480" w:lineRule="auto"/>
     </w:pPr>
-    <w:rPr>
-      <w:rFonts w:ascii="Arial" w:hAnsi="Arial"/>
-    </w:rPr>
   </w:style>
   <w:style w:type="character" w:customStyle="1" w:styleId="BodyText2Char">
     <w:name w:val="Body Text 2 Char"/>
@@ -1438,9 +1054,6 @@
     <w:link w:val="BodyText2"/>
     <w:uiPriority w:val="99"/>
     <w:rsid w:val="00AA1D8D"/>
-    <w:rPr>
-      <w:rFonts w:ascii="Arial" w:hAnsi="Arial"/>
-    </w:rPr>
   </w:style>
   <w:style w:type="paragraph" w:styleId="BodyText3">
     <w:name w:val="Body Text 3"/>
@@ -1453,7 +1066,6 @@
       <w:spacing w:after="120"/>
     </w:pPr>
     <w:rPr>
-      <w:rFonts w:ascii="Arial" w:hAnsi="Arial"/>
       <w:sz w:val="16"/>
       <w:szCs w:val="16"/>
     </w:rPr>
@@ -1465,7 +1077,6 @@
     <w:uiPriority w:val="99"/>
     <w:rsid w:val="00AA1D8D"/>
     <w:rPr>
-      <w:rFonts w:ascii="Arial" w:hAnsi="Arial"/>
       <w:sz w:val="16"/>
       <w:szCs w:val="16"/>
     </w:rPr>
@@ -1480,9 +1091,6 @@
       <w:ind w:left="360" w:hanging="360"/>
       <w:contextualSpacing/>
     </w:pPr>
-    <w:rPr>
-      <w:rFonts w:ascii="Arial" w:hAnsi="Arial"/>
-    </w:rPr>
   </w:style>
   <w:style w:type="paragraph" w:styleId="List2">
     <w:name w:val="List 2"/>
@@ -1494,9 +1102,6 @@
       <w:ind w:left="720" w:hanging="360"/>
       <w:contextualSpacing/>
     </w:pPr>
-    <w:rPr>
-      <w:rFonts w:ascii="Arial" w:hAnsi="Arial"/>
-    </w:rPr>
   </w:style>
   <w:style w:type="paragraph" w:styleId="List3">
     <w:name w:val="List 3"/>
@@ -1508,9 +1113,6 @@
       <w:ind w:left="1080" w:hanging="360"/>
       <w:contextualSpacing/>
     </w:pPr>
-    <w:rPr>
-      <w:rFonts w:ascii="Arial" w:hAnsi="Arial"/>
-    </w:rPr>
   </w:style>
   <w:style w:type="paragraph" w:styleId="ListBullet">
     <w:name w:val="List Bullet"/>
@@ -1524,9 +1126,6 @@
       </w:numPr>
       <w:contextualSpacing/>
     </w:pPr>
-    <w:rPr>
-      <w:rFonts w:ascii="Arial" w:hAnsi="Arial"/>
-    </w:rPr>
   </w:style>
   <w:style w:type="paragraph" w:styleId="ListBullet2">
     <w:name w:val="List Bullet 2"/>
@@ -1540,9 +1139,6 @@
       </w:numPr>
       <w:contextualSpacing/>
     </w:pPr>
-    <w:rPr>
-      <w:rFonts w:ascii="Arial" w:hAnsi="Arial"/>
-    </w:rPr>
   </w:style>
   <w:style w:type="paragraph" w:styleId="ListBullet3">
     <w:name w:val="List Bullet 3"/>
@@ -1556,9 +1152,6 @@
       </w:numPr>
       <w:contextualSpacing/>
     </w:pPr>
-    <w:rPr>
-      <w:rFonts w:ascii="Arial" w:hAnsi="Arial"/>
-    </w:rPr>
   </w:style>
   <w:style w:type="paragraph" w:styleId="ListNumber">
     <w:name w:val="List Number"/>
@@ -1572,9 +1165,6 @@
       </w:numPr>
       <w:contextualSpacing/>
     </w:pPr>
-    <w:rPr>
-      <w:rFonts w:ascii="Arial" w:hAnsi="Arial"/>
-    </w:rPr>
   </w:style>
   <w:style w:type="paragraph" w:styleId="ListNumber2">
     <w:name w:val="List Number 2"/>
@@ -1588,9 +1178,6 @@
       </w:numPr>
       <w:contextualSpacing/>
     </w:pPr>
-    <w:rPr>
-      <w:rFonts w:ascii="Arial" w:hAnsi="Arial"/>
-    </w:rPr>
   </w:style>
   <w:style w:type="paragraph" w:styleId="ListNumber3">
     <w:name w:val="List Number 3"/>
@@ -1604,9 +1191,6 @@
       </w:numPr>
       <w:contextualSpacing/>
     </w:pPr>
-    <w:rPr>
-      <w:rFonts w:ascii="Arial" w:hAnsi="Arial"/>
-    </w:rPr>
   </w:style>
   <w:style w:type="paragraph" w:styleId="ListContinue">
     <w:name w:val="List Continue"/>
@@ -1619,9 +1203,6 @@
       <w:ind w:left="360"/>
       <w:contextualSpacing/>
     </w:pPr>
-    <w:rPr>
-      <w:rFonts w:ascii="Arial" w:hAnsi="Arial"/>
-    </w:rPr>
   </w:style>
   <w:style w:type="paragraph" w:styleId="ListContinue2">
     <w:name w:val="List Continue 2"/>
@@ -1634,9 +1215,6 @@
       <w:ind w:left="720"/>
       <w:contextualSpacing/>
     </w:pPr>
-    <w:rPr>
-      <w:rFonts w:ascii="Arial" w:hAnsi="Arial"/>
-    </w:rPr>
   </w:style>
   <w:style w:type="paragraph" w:styleId="ListContinue3">
     <w:name w:val="List Continue 3"/>
@@ -1649,9 +1227,6 @@
       <w:ind w:left="1080"/>
       <w:contextualSpacing/>
     </w:pPr>
-    <w:rPr>
-      <w:rFonts w:ascii="Arial" w:hAnsi="Arial"/>
-    </w:rPr>
   </w:style>
   <w:style w:type="paragraph" w:styleId="MacroText">
     <w:name w:val="macro"/>
@@ -1671,7 +1246,7 @@
       </w:tabs>
     </w:pPr>
     <w:rPr>
-      <w:rFonts w:ascii="Arial" w:hAnsi="Arial"/>
+      <w:rFonts w:ascii="Courier" w:hAnsi="Courier"/>
       <w:sz w:val="20"/>
       <w:szCs w:val="20"/>
     </w:rPr>
@@ -1683,7 +1258,7 @@
     <w:uiPriority w:val="99"/>
     <w:rsid w:val="0029639D"/>
     <w:rPr>
-      <w:rFonts w:ascii="Arial" w:hAnsi="Arial"/>
+      <w:rFonts w:ascii="Courier" w:hAnsi="Courier"/>
       <w:sz w:val="20"/>
       <w:szCs w:val="20"/>
     </w:rPr>
@@ -1697,7 +1272,6 @@
     <w:qFormat/>
     <w:rsid w:val="00FC693F"/>
     <w:rPr>
-      <w:rFonts w:ascii="Arial" w:hAnsi="Arial"/>
       <w:i/>
       <w:iCs/>
       <w:color w:val="000000" w:themeColor="text1"/>
@@ -1710,7 +1284,6 @@
     <w:uiPriority w:val="29"/>
     <w:rsid w:val="00FC693F"/>
     <w:rPr>
-      <w:rFonts w:ascii="Arial" w:hAnsi="Arial"/>
       <w:i/>
       <w:iCs/>
       <w:color w:val="000000" w:themeColor="text1"/>
@@ -1724,7 +1297,7 @@
     <w:semiHidden/>
     <w:rsid w:val="00FC693F"/>
     <w:rPr>
-      <w:rFonts w:asciiTheme="majorHAnsi" w:eastAsiaTheme="majorEastAsia" w:hAnsiTheme="majorHAnsi" w:cstheme="majorBidi" w:ascii="Arial" w:hAnsi="Arial"/>
+      <w:rFonts w:asciiTheme="majorHAnsi" w:eastAsiaTheme="majorEastAsia" w:hAnsiTheme="majorHAnsi" w:cstheme="majorBidi"/>
       <w:b/>
       <w:bCs/>
       <w:i/>
@@ -1740,7 +1313,7 @@
     <w:semiHidden/>
     <w:rsid w:val="00FC693F"/>
     <w:rPr>
-      <w:rFonts w:asciiTheme="majorHAnsi" w:eastAsiaTheme="majorEastAsia" w:hAnsiTheme="majorHAnsi" w:cstheme="majorBidi" w:ascii="Arial" w:hAnsi="Arial"/>
+      <w:rFonts w:asciiTheme="majorHAnsi" w:eastAsiaTheme="majorEastAsia" w:hAnsiTheme="majorHAnsi" w:cstheme="majorBidi"/>
       <w:color w:val="243F60" w:themeColor="accent1" w:themeShade="7F"/>
     </w:rPr>
   </w:style>
@@ -1752,7 +1325,7 @@
     <w:semiHidden/>
     <w:rsid w:val="00FC693F"/>
     <w:rPr>
-      <w:rFonts w:asciiTheme="majorHAnsi" w:eastAsiaTheme="majorEastAsia" w:hAnsiTheme="majorHAnsi" w:cstheme="majorBidi" w:ascii="Arial" w:hAnsi="Arial"/>
+      <w:rFonts w:asciiTheme="majorHAnsi" w:eastAsiaTheme="majorEastAsia" w:hAnsiTheme="majorHAnsi" w:cstheme="majorBidi"/>
       <w:i/>
       <w:iCs/>
       <w:color w:val="243F60" w:themeColor="accent1" w:themeShade="7F"/>
@@ -1766,7 +1339,7 @@
     <w:semiHidden/>
     <w:rsid w:val="00FC693F"/>
     <w:rPr>
-      <w:rFonts w:asciiTheme="majorHAnsi" w:eastAsiaTheme="majorEastAsia" w:hAnsiTheme="majorHAnsi" w:cstheme="majorBidi" w:ascii="Arial" w:hAnsi="Arial"/>
+      <w:rFonts w:asciiTheme="majorHAnsi" w:eastAsiaTheme="majorEastAsia" w:hAnsiTheme="majorHAnsi" w:cstheme="majorBidi"/>
       <w:i/>
       <w:iCs/>
       <w:color w:val="404040" w:themeColor="text1" w:themeTint="BF"/>
@@ -1780,7 +1353,7 @@
     <w:semiHidden/>
     <w:rsid w:val="00FC693F"/>
     <w:rPr>
-      <w:rFonts w:asciiTheme="majorHAnsi" w:eastAsiaTheme="majorEastAsia" w:hAnsiTheme="majorHAnsi" w:cstheme="majorBidi" w:ascii="Arial" w:hAnsi="Arial"/>
+      <w:rFonts w:asciiTheme="majorHAnsi" w:eastAsiaTheme="majorEastAsia" w:hAnsiTheme="majorHAnsi" w:cstheme="majorBidi"/>
       <w:color w:val="4F81BD" w:themeColor="accent1"/>
       <w:sz w:val="20"/>
       <w:szCs w:val="20"/>
@@ -1794,7 +1367,7 @@
     <w:semiHidden/>
     <w:rsid w:val="00FC693F"/>
     <w:rPr>
-      <w:rFonts w:asciiTheme="majorHAnsi" w:eastAsiaTheme="majorEastAsia" w:hAnsiTheme="majorHAnsi" w:cstheme="majorBidi" w:ascii="Arial" w:hAnsi="Arial"/>
+      <w:rFonts w:asciiTheme="majorHAnsi" w:eastAsiaTheme="majorEastAsia" w:hAnsiTheme="majorHAnsi" w:cstheme="majorBidi"/>
       <w:i/>
       <w:iCs/>
       <w:color w:val="404040" w:themeColor="text1" w:themeTint="BF"/>
@@ -1815,7 +1388,6 @@
       <w:spacing w:line="240" w:lineRule="auto"/>
     </w:pPr>
     <w:rPr>
-      <w:rFonts w:ascii="Arial" w:hAnsi="Arial"/>
       <w:b/>
       <w:bCs/>
       <w:color w:val="4F81BD" w:themeColor="accent1"/>
@@ -1830,7 +1402,6 @@
     <w:qFormat/>
     <w:rsid w:val="00FC693F"/>
     <w:rPr>
-      <w:rFonts w:ascii="Arial" w:hAnsi="Arial"/>
       <w:b/>
       <w:bCs/>
     </w:rPr>
@@ -1842,7 +1413,6 @@
     <w:qFormat/>
     <w:rsid w:val="00FC693F"/>
     <w:rPr>
-      <w:rFonts w:ascii="Arial" w:hAnsi="Arial"/>
       <w:i/>
       <w:iCs/>
     </w:rPr>
@@ -1863,7 +1433,6 @@
       <w:ind w:left="936" w:right="936"/>
     </w:pPr>
     <w:rPr>
-      <w:rFonts w:ascii="Arial" w:hAnsi="Arial"/>
       <w:b/>
       <w:bCs/>
       <w:i/>
@@ -1878,7 +1447,6 @@
     <w:uiPriority w:val="30"/>
     <w:rsid w:val="00FC693F"/>
     <w:rPr>
-      <w:rFonts w:ascii="Arial" w:hAnsi="Arial"/>
       <w:b/>
       <w:bCs/>
       <w:i/>
@@ -1893,7 +1461,6 @@
     <w:qFormat/>
     <w:rsid w:val="00FC693F"/>
     <w:rPr>
-      <w:rFonts w:ascii="Arial" w:hAnsi="Arial"/>
       <w:i/>
       <w:iCs/>
       <w:color w:val="808080" w:themeColor="text1" w:themeTint="7F"/>
@@ -1906,7 +1473,6 @@
     <w:qFormat/>
     <w:rsid w:val="00FC693F"/>
     <w:rPr>
-      <w:rFonts w:ascii="Arial" w:hAnsi="Arial"/>
       <w:b/>
       <w:bCs/>
       <w:i/>
@@ -1921,7 +1487,6 @@
     <w:qFormat/>
     <w:rsid w:val="00FC693F"/>
     <w:rPr>
-      <w:rFonts w:ascii="Arial" w:hAnsi="Arial"/>
       <w:smallCaps/>
       <w:color w:val="C0504D" w:themeColor="accent2"/>
       <w:u w:val="single"/>
@@ -1934,7 +1499,6 @@
     <w:qFormat/>
     <w:rsid w:val="00FC693F"/>
     <w:rPr>
-      <w:rFonts w:ascii="Arial" w:hAnsi="Arial"/>
       <w:b/>
       <w:bCs/>
       <w:smallCaps/>
@@ -1950,7 +1514,6 @@
     <w:qFormat/>
     <w:rsid w:val="00FC693F"/>
     <w:rPr>
-      <w:rFonts w:ascii="Arial" w:hAnsi="Arial"/>
       <w:b/>
       <w:bCs/>
       <w:smallCaps/>
@@ -1969,9 +1532,6 @@
     <w:pPr>
       <w:outlineLvl w:val="9"/>
     </w:pPr>
-    <w:rPr>
-      <w:rFonts w:ascii="Arial" w:hAnsi="Arial"/>
-    </w:rPr>
   </w:style>
   <w:style w:type="table" w:styleId="TableGrid">
     <w:name w:val="Table Grid"/>
@@ -1981,9 +1541,6 @@
     <w:pPr>
       <w:spacing w:after="0" w:line="240" w:lineRule="auto"/>
     </w:pPr>
-    <w:rPr>
-      <w:rFonts w:ascii="Arial" w:hAnsi="Arial"/>
-    </w:rPr>
     <w:tblPr>
       <w:tblInd w:w="0" w:type="dxa"/>
       <w:tblBorders>
@@ -2011,7 +1568,6 @@
       <w:spacing w:after="0" w:line="240" w:lineRule="auto"/>
     </w:pPr>
     <w:rPr>
-      <w:rFonts w:ascii="Arial" w:hAnsi="Arial"/>
       <w:color w:val="000000" w:themeColor="text1" w:themeShade="BF"/>
     </w:rPr>
     <w:tblPr>
@@ -2115,7 +1671,6 @@
       <w:spacing w:after="0" w:line="240" w:lineRule="auto"/>
     </w:pPr>
     <w:rPr>
-      <w:rFonts w:ascii="Arial" w:hAnsi="Arial"/>
       <w:color w:val="365F91" w:themeColor="accent1" w:themeShade="BF"/>
     </w:rPr>
     <w:tblPr>
@@ -2219,7 +1774,6 @@
       <w:spacing w:after="0" w:line="240" w:lineRule="auto"/>
     </w:pPr>
     <w:rPr>
-      <w:rFonts w:ascii="Arial" w:hAnsi="Arial"/>
       <w:color w:val="943634" w:themeColor="accent2" w:themeShade="BF"/>
     </w:rPr>
     <w:tblPr>
@@ -2323,7 +1877,6 @@
       <w:spacing w:after="0" w:line="240" w:lineRule="auto"/>
     </w:pPr>
     <w:rPr>
-      <w:rFonts w:ascii="Arial" w:hAnsi="Arial"/>
       <w:color w:val="76923C" w:themeColor="accent3" w:themeShade="BF"/>
     </w:rPr>
     <w:tblPr>
@@ -2427,7 +1980,6 @@
       <w:spacing w:after="0" w:line="240" w:lineRule="auto"/>
     </w:pPr>
     <w:rPr>
-      <w:rFonts w:ascii="Arial" w:hAnsi="Arial"/>
       <w:color w:val="5F497A" w:themeColor="accent4" w:themeShade="BF"/>
     </w:rPr>
     <w:tblPr>
@@ -2531,7 +2083,6 @@
       <w:spacing w:after="0" w:line="240" w:lineRule="auto"/>
     </w:pPr>
     <w:rPr>
-      <w:rFonts w:ascii="Arial" w:hAnsi="Arial"/>
       <w:color w:val="31849B" w:themeColor="accent5" w:themeShade="BF"/>
     </w:rPr>
     <w:tblPr>
@@ -2635,7 +2186,6 @@
       <w:spacing w:after="0" w:line="240" w:lineRule="auto"/>
     </w:pPr>
     <w:rPr>
-      <w:rFonts w:ascii="Arial" w:hAnsi="Arial"/>
       <w:color w:val="E36C0A" w:themeColor="accent6" w:themeShade="BF"/>
     </w:rPr>
     <w:tblPr>
@@ -2738,9 +2288,6 @@
     <w:pPr>
       <w:spacing w:after="0" w:line="240" w:lineRule="auto"/>
     </w:pPr>
-    <w:rPr>
-      <w:rFonts w:ascii="Arial" w:hAnsi="Arial"/>
-    </w:rPr>
     <w:tblPr>
       <w:tblStyleRowBandSize w:val="1"/>
       <w:tblStyleColBandSize w:val="1"/>
@@ -2833,9 +2380,6 @@
     <w:pPr>
       <w:spacing w:after="0" w:line="240" w:lineRule="auto"/>
     </w:pPr>
-    <w:rPr>
-      <w:rFonts w:ascii="Arial" w:hAnsi="Arial"/>
-    </w:rPr>
     <w:tblPr>
       <w:tblStyleRowBandSize w:val="1"/>
       <w:tblStyleColBandSize w:val="1"/>
@@ -2928,9 +2472,6 @@
     <w:pPr>
       <w:spacing w:after="0" w:line="240" w:lineRule="auto"/>
     </w:pPr>
-    <w:rPr>
-      <w:rFonts w:ascii="Arial" w:hAnsi="Arial"/>
-    </w:rPr>
     <w:tblPr>
       <w:tblStyleRowBandSize w:val="1"/>
       <w:tblStyleColBandSize w:val="1"/>
@@ -3023,9 +2564,6 @@
     <w:pPr>
       <w:spacing w:after="0" w:line="240" w:lineRule="auto"/>
     </w:pPr>
-    <w:rPr>
-      <w:rFonts w:ascii="Arial" w:hAnsi="Arial"/>
-    </w:rPr>
     <w:tblPr>
       <w:tblStyleRowBandSize w:val="1"/>
       <w:tblStyleColBandSize w:val="1"/>
@@ -3118,9 +2656,6 @@
     <w:pPr>
       <w:spacing w:after="0" w:line="240" w:lineRule="auto"/>
     </w:pPr>
-    <w:rPr>
-      <w:rFonts w:ascii="Arial" w:hAnsi="Arial"/>
-    </w:rPr>
     <w:tblPr>
       <w:tblStyleRowBandSize w:val="1"/>
       <w:tblStyleColBandSize w:val="1"/>
@@ -3213,9 +2748,6 @@
     <w:pPr>
       <w:spacing w:after="0" w:line="240" w:lineRule="auto"/>
     </w:pPr>
-    <w:rPr>
-      <w:rFonts w:ascii="Arial" w:hAnsi="Arial"/>
-    </w:rPr>
     <w:tblPr>
       <w:tblStyleRowBandSize w:val="1"/>
       <w:tblStyleColBandSize w:val="1"/>
@@ -3308,9 +2840,6 @@
     <w:pPr>
       <w:spacing w:after="0" w:line="240" w:lineRule="auto"/>
     </w:pPr>
-    <w:rPr>
-      <w:rFonts w:ascii="Arial" w:hAnsi="Arial"/>
-    </w:rPr>
     <w:tblPr>
       <w:tblStyleRowBandSize w:val="1"/>
       <w:tblStyleColBandSize w:val="1"/>
@@ -3403,9 +2932,6 @@
     <w:pPr>
       <w:spacing w:after="0" w:line="240" w:lineRule="auto"/>
     </w:pPr>
-    <w:rPr>
-      <w:rFonts w:ascii="Arial" w:hAnsi="Arial"/>
-    </w:rPr>
     <w:tblPr>
       <w:tblStyleRowBandSize w:val="1"/>
       <w:tblStyleColBandSize w:val="1"/>
@@ -3536,9 +3062,6 @@
     <w:pPr>
       <w:spacing w:after="0" w:line="240" w:lineRule="auto"/>
     </w:pPr>
-    <w:rPr>
-      <w:rFonts w:ascii="Arial" w:hAnsi="Arial"/>
-    </w:rPr>
     <w:tblPr>
       <w:tblStyleRowBandSize w:val="1"/>
       <w:tblStyleColBandSize w:val="1"/>
@@ -3669,9 +3192,6 @@
     <w:pPr>
       <w:spacing w:after="0" w:line="240" w:lineRule="auto"/>
     </w:pPr>
-    <w:rPr>
-      <w:rFonts w:ascii="Arial" w:hAnsi="Arial"/>
-    </w:rPr>
     <w:tblPr>
       <w:tblStyleRowBandSize w:val="1"/>
       <w:tblStyleColBandSize w:val="1"/>
@@ -3802,9 +3322,6 @@
     <w:pPr>
       <w:spacing w:after="0" w:line="240" w:lineRule="auto"/>
     </w:pPr>
-    <w:rPr>
-      <w:rFonts w:ascii="Arial" w:hAnsi="Arial"/>
-    </w:rPr>
     <w:tblPr>
       <w:tblStyleRowBandSize w:val="1"/>
       <w:tblStyleColBandSize w:val="1"/>
@@ -3935,9 +3452,6 @@
     <w:pPr>
       <w:spacing w:after="0" w:line="240" w:lineRule="auto"/>
     </w:pPr>
-    <w:rPr>
-      <w:rFonts w:ascii="Arial" w:hAnsi="Arial"/>
-    </w:rPr>
     <w:tblPr>
       <w:tblStyleRowBandSize w:val="1"/>
       <w:tblStyleColBandSize w:val="1"/>
@@ -4068,9 +3582,6 @@
     <w:pPr>
       <w:spacing w:after="0" w:line="240" w:lineRule="auto"/>
     </w:pPr>
-    <w:rPr>
-      <w:rFonts w:ascii="Arial" w:hAnsi="Arial"/>
-    </w:rPr>
     <w:tblPr>
       <w:tblStyleRowBandSize w:val="1"/>
       <w:tblStyleColBandSize w:val="1"/>
@@ -4201,9 +3712,6 @@
     <w:pPr>
       <w:spacing w:after="0" w:line="240" w:lineRule="auto"/>
     </w:pPr>
-    <w:rPr>
-      <w:rFonts w:ascii="Arial" w:hAnsi="Arial"/>
-    </w:rPr>
     <w:tblPr>
       <w:tblStyleRowBandSize w:val="1"/>
       <w:tblStyleColBandSize w:val="1"/>
@@ -4334,9 +3842,6 @@
     <w:pPr>
       <w:spacing w:after="0" w:line="240" w:lineRule="auto"/>
     </w:pPr>
-    <w:rPr>
-      <w:rFonts w:ascii="Arial" w:hAnsi="Arial"/>
-    </w:rPr>
     <w:tblPr>
       <w:tblStyleRowBandSize w:val="1"/>
       <w:tblStyleColBandSize w:val="1"/>
@@ -4443,9 +3948,6 @@
     <w:pPr>
       <w:spacing w:after="0" w:line="240" w:lineRule="auto"/>
     </w:pPr>
-    <w:rPr>
-      <w:rFonts w:ascii="Arial" w:hAnsi="Arial"/>
-    </w:rPr>
     <w:tblPr>
       <w:tblStyleRowBandSize w:val="1"/>
       <w:tblStyleColBandSize w:val="1"/>
@@ -4552,9 +4054,6 @@
     <w:pPr>
       <w:spacing w:after="0" w:line="240" w:lineRule="auto"/>
     </w:pPr>
-    <w:rPr>
-      <w:rFonts w:ascii="Arial" w:hAnsi="Arial"/>
-    </w:rPr>
     <w:tblPr>
       <w:tblStyleRowBandSize w:val="1"/>
       <w:tblStyleColBandSize w:val="1"/>
@@ -4661,9 +4160,6 @@
     <w:pPr>
       <w:spacing w:after="0" w:line="240" w:lineRule="auto"/>
     </w:pPr>
-    <w:rPr>
-      <w:rFonts w:ascii="Arial" w:hAnsi="Arial"/>
-    </w:rPr>
     <w:tblPr>
       <w:tblStyleRowBandSize w:val="1"/>
       <w:tblStyleColBandSize w:val="1"/>
@@ -4770,9 +4266,6 @@
     <w:pPr>
       <w:spacing w:after="0" w:line="240" w:lineRule="auto"/>
     </w:pPr>
-    <w:rPr>
-      <w:rFonts w:ascii="Arial" w:hAnsi="Arial"/>
-    </w:rPr>
     <w:tblPr>
       <w:tblStyleRowBandSize w:val="1"/>
       <w:tblStyleColBandSize w:val="1"/>
@@ -4879,9 +4372,6 @@
     <w:pPr>
       <w:spacing w:after="0" w:line="240" w:lineRule="auto"/>
     </w:pPr>
-    <w:rPr>
-      <w:rFonts w:ascii="Arial" w:hAnsi="Arial"/>
-    </w:rPr>
     <w:tblPr>
       <w:tblStyleRowBandSize w:val="1"/>
       <w:tblStyleColBandSize w:val="1"/>
@@ -4988,9 +4478,6 @@
     <w:pPr>
       <w:spacing w:after="0" w:line="240" w:lineRule="auto"/>
     </w:pPr>
-    <w:rPr>
-      <w:rFonts w:ascii="Arial" w:hAnsi="Arial"/>
-    </w:rPr>
     <w:tblPr>
       <w:tblStyleRowBandSize w:val="1"/>
       <w:tblStyleColBandSize w:val="1"/>
@@ -5097,9 +4584,6 @@
     <w:pPr>
       <w:spacing w:after="0" w:line="240" w:lineRule="auto"/>
     </w:pPr>
-    <w:rPr>
-      <w:rFonts w:ascii="Arial" w:hAnsi="Arial"/>
-    </w:rPr>
     <w:tblPr>
       <w:tblStyleRowBandSize w:val="1"/>
       <w:tblStyleColBandSize w:val="1"/>
@@ -5249,9 +4733,6 @@
     <w:pPr>
       <w:spacing w:after="0" w:line="240" w:lineRule="auto"/>
     </w:pPr>
-    <w:rPr>
-      <w:rFonts w:ascii="Arial" w:hAnsi="Arial"/>
-    </w:rPr>
     <w:tblPr>
       <w:tblStyleRowBandSize w:val="1"/>
       <w:tblStyleColBandSize w:val="1"/>
@@ -5401,9 +4882,6 @@
     <w:pPr>
       <w:spacing w:after="0" w:line="240" w:lineRule="auto"/>
     </w:pPr>
-    <w:rPr>
-      <w:rFonts w:ascii="Arial" w:hAnsi="Arial"/>
-    </w:rPr>
     <w:tblPr>
       <w:tblStyleRowBandSize w:val="1"/>
       <w:tblStyleColBandSize w:val="1"/>
@@ -5553,9 +5031,6 @@
     <w:pPr>
       <w:spacing w:after="0" w:line="240" w:lineRule="auto"/>
     </w:pPr>
-    <w:rPr>
-      <w:rFonts w:ascii="Arial" w:hAnsi="Arial"/>
-    </w:rPr>
     <w:tblPr>
       <w:tblStyleRowBandSize w:val="1"/>
       <w:tblStyleColBandSize w:val="1"/>
@@ -5705,9 +5180,6 @@
     <w:pPr>
       <w:spacing w:after="0" w:line="240" w:lineRule="auto"/>
     </w:pPr>
-    <w:rPr>
-      <w:rFonts w:ascii="Arial" w:hAnsi="Arial"/>
-    </w:rPr>
     <w:tblPr>
       <w:tblStyleRowBandSize w:val="1"/>
       <w:tblStyleColBandSize w:val="1"/>
@@ -5857,9 +5329,6 @@
     <w:pPr>
       <w:spacing w:after="0" w:line="240" w:lineRule="auto"/>
     </w:pPr>
-    <w:rPr>
-      <w:rFonts w:ascii="Arial" w:hAnsi="Arial"/>
-    </w:rPr>
     <w:tblPr>
       <w:tblStyleRowBandSize w:val="1"/>
       <w:tblStyleColBandSize w:val="1"/>
@@ -6009,9 +5478,6 @@
     <w:pPr>
       <w:spacing w:after="0" w:line="240" w:lineRule="auto"/>
     </w:pPr>
-    <w:rPr>
-      <w:rFonts w:ascii="Arial" w:hAnsi="Arial"/>
-    </w:rPr>
     <w:tblPr>
       <w:tblStyleRowBandSize w:val="1"/>
       <w:tblStyleColBandSize w:val="1"/>
@@ -6162,7 +5628,6 @@
       <w:spacing w:after="0" w:line="240" w:lineRule="auto"/>
     </w:pPr>
     <w:rPr>
-      <w:rFonts w:ascii="Arial" w:hAnsi="Arial"/>
       <w:color w:val="000000" w:themeColor="text1"/>
     </w:rPr>
     <w:tblPr>
@@ -6247,7 +5712,6 @@
       <w:spacing w:after="0" w:line="240" w:lineRule="auto"/>
     </w:pPr>
     <w:rPr>
-      <w:rFonts w:ascii="Arial" w:hAnsi="Arial"/>
       <w:color w:val="000000" w:themeColor="text1"/>
     </w:rPr>
     <w:tblPr>
@@ -6332,7 +5796,6 @@
       <w:spacing w:after="0" w:line="240" w:lineRule="auto"/>
     </w:pPr>
     <w:rPr>
-      <w:rFonts w:ascii="Arial" w:hAnsi="Arial"/>
       <w:color w:val="000000" w:themeColor="text1"/>
     </w:rPr>
     <w:tblPr>
@@ -6417,7 +5880,6 @@
       <w:spacing w:after="0" w:line="240" w:lineRule="auto"/>
     </w:pPr>
     <w:rPr>
-      <w:rFonts w:ascii="Arial" w:hAnsi="Arial"/>
       <w:color w:val="000000" w:themeColor="text1"/>
     </w:rPr>
     <w:tblPr>
@@ -6502,7 +5964,6 @@
       <w:spacing w:after="0" w:line="240" w:lineRule="auto"/>
     </w:pPr>
     <w:rPr>
-      <w:rFonts w:ascii="Arial" w:hAnsi="Arial"/>
       <w:color w:val="000000" w:themeColor="text1"/>
     </w:rPr>
     <w:tblPr>
@@ -6587,7 +6048,6 @@
       <w:spacing w:after="0" w:line="240" w:lineRule="auto"/>
     </w:pPr>
     <w:rPr>
-      <w:rFonts w:ascii="Arial" w:hAnsi="Arial"/>
       <w:color w:val="000000" w:themeColor="text1"/>
     </w:rPr>
     <w:tblPr>
@@ -6672,7 +6132,6 @@
       <w:spacing w:after="0" w:line="240" w:lineRule="auto"/>
     </w:pPr>
     <w:rPr>
-      <w:rFonts w:ascii="Arial" w:hAnsi="Arial"/>
       <w:color w:val="000000" w:themeColor="text1"/>
     </w:rPr>
     <w:tblPr>
@@ -6757,7 +6216,7 @@
       <w:spacing w:after="0" w:line="240" w:lineRule="auto"/>
     </w:pPr>
     <w:rPr>
-      <w:rFonts w:asciiTheme="majorHAnsi" w:eastAsiaTheme="majorEastAsia" w:hAnsiTheme="majorHAnsi" w:cstheme="majorBidi" w:ascii="Arial" w:hAnsi="Arial"/>
+      <w:rFonts w:asciiTheme="majorHAnsi" w:eastAsiaTheme="majorEastAsia" w:hAnsiTheme="majorHAnsi" w:cstheme="majorBidi"/>
       <w:color w:val="000000" w:themeColor="text1"/>
     </w:rPr>
     <w:tblPr>
@@ -6885,7 +6344,7 @@
       <w:spacing w:after="0" w:line="240" w:lineRule="auto"/>
     </w:pPr>
     <w:rPr>
-      <w:rFonts w:asciiTheme="majorHAnsi" w:eastAsiaTheme="majorEastAsia" w:hAnsiTheme="majorHAnsi" w:cstheme="majorBidi" w:ascii="Arial" w:hAnsi="Arial"/>
+      <w:rFonts w:asciiTheme="majorHAnsi" w:eastAsiaTheme="majorEastAsia" w:hAnsiTheme="majorHAnsi" w:cstheme="majorBidi"/>
       <w:color w:val="000000" w:themeColor="text1"/>
     </w:rPr>
     <w:tblPr>
@@ -7013,7 +6472,7 @@
       <w:spacing w:after="0" w:line="240" w:lineRule="auto"/>
     </w:pPr>
     <w:rPr>
-      <w:rFonts w:asciiTheme="majorHAnsi" w:eastAsiaTheme="majorEastAsia" w:hAnsiTheme="majorHAnsi" w:cstheme="majorBidi" w:ascii="Arial" w:hAnsi="Arial"/>
+      <w:rFonts w:asciiTheme="majorHAnsi" w:eastAsiaTheme="majorEastAsia" w:hAnsiTheme="majorHAnsi" w:cstheme="majorBidi"/>
       <w:color w:val="000000" w:themeColor="text1"/>
     </w:rPr>
     <w:tblPr>
@@ -7141,7 +6600,7 @@
       <w:spacing w:after="0" w:line="240" w:lineRule="auto"/>
     </w:pPr>
     <w:rPr>
-      <w:rFonts w:asciiTheme="majorHAnsi" w:eastAsiaTheme="majorEastAsia" w:hAnsiTheme="majorHAnsi" w:cstheme="majorBidi" w:ascii="Arial" w:hAnsi="Arial"/>
+      <w:rFonts w:asciiTheme="majorHAnsi" w:eastAsiaTheme="majorEastAsia" w:hAnsiTheme="majorHAnsi" w:cstheme="majorBidi"/>
       <w:color w:val="000000" w:themeColor="text1"/>
     </w:rPr>
     <w:tblPr>
@@ -7269,7 +6728,7 @@
       <w:spacing w:after="0" w:line="240" w:lineRule="auto"/>
     </w:pPr>
     <w:rPr>
-      <w:rFonts w:asciiTheme="majorHAnsi" w:eastAsiaTheme="majorEastAsia" w:hAnsiTheme="majorHAnsi" w:cstheme="majorBidi" w:ascii="Arial" w:hAnsi="Arial"/>
+      <w:rFonts w:asciiTheme="majorHAnsi" w:eastAsiaTheme="majorEastAsia" w:hAnsiTheme="majorHAnsi" w:cstheme="majorBidi"/>
       <w:color w:val="000000" w:themeColor="text1"/>
     </w:rPr>
     <w:tblPr>
@@ -7397,7 +6856,7 @@
       <w:spacing w:after="0" w:line="240" w:lineRule="auto"/>
     </w:pPr>
     <w:rPr>
-      <w:rFonts w:asciiTheme="majorHAnsi" w:eastAsiaTheme="majorEastAsia" w:hAnsiTheme="majorHAnsi" w:cstheme="majorBidi" w:ascii="Arial" w:hAnsi="Arial"/>
+      <w:rFonts w:asciiTheme="majorHAnsi" w:eastAsiaTheme="majorEastAsia" w:hAnsiTheme="majorHAnsi" w:cstheme="majorBidi"/>
       <w:color w:val="000000" w:themeColor="text1"/>
     </w:rPr>
     <w:tblPr>
@@ -7525,7 +6984,7 @@
       <w:spacing w:after="0" w:line="240" w:lineRule="auto"/>
     </w:pPr>
     <w:rPr>
-      <w:rFonts w:asciiTheme="majorHAnsi" w:eastAsiaTheme="majorEastAsia" w:hAnsiTheme="majorHAnsi" w:cstheme="majorBidi" w:ascii="Arial" w:hAnsi="Arial"/>
+      <w:rFonts w:asciiTheme="majorHAnsi" w:eastAsiaTheme="majorEastAsia" w:hAnsiTheme="majorHAnsi" w:cstheme="majorBidi"/>
       <w:color w:val="000000" w:themeColor="text1"/>
     </w:rPr>
     <w:tblPr>
@@ -7652,9 +7111,6 @@
     <w:pPr>
       <w:spacing w:after="0" w:line="240" w:lineRule="auto"/>
     </w:pPr>
-    <w:rPr>
-      <w:rFonts w:ascii="Arial" w:hAnsi="Arial"/>
-    </w:rPr>
     <w:tblPr>
       <w:tblStyleRowBandSize w:val="1"/>
       <w:tblStyleColBandSize w:val="1"/>
@@ -7728,9 +7184,6 @@
     <w:pPr>
       <w:spacing w:after="0" w:line="240" w:lineRule="auto"/>
     </w:pPr>
-    <w:rPr>
-      <w:rFonts w:ascii="Arial" w:hAnsi="Arial"/>
-    </w:rPr>
     <w:tblPr>
       <w:tblStyleRowBandSize w:val="1"/>
       <w:tblStyleColBandSize w:val="1"/>
@@ -7804,9 +7257,6 @@
     <w:pPr>
       <w:spacing w:after="0" w:line="240" w:lineRule="auto"/>
     </w:pPr>
-    <w:rPr>
-      <w:rFonts w:ascii="Arial" w:hAnsi="Arial"/>
-    </w:rPr>
     <w:tblPr>
       <w:tblStyleRowBandSize w:val="1"/>
       <w:tblStyleColBandSize w:val="1"/>
@@ -7880,9 +7330,6 @@
     <w:pPr>
       <w:spacing w:after="0" w:line="240" w:lineRule="auto"/>
     </w:pPr>
-    <w:rPr>
-      <w:rFonts w:ascii="Arial" w:hAnsi="Arial"/>
-    </w:rPr>
     <w:tblPr>
       <w:tblStyleRowBandSize w:val="1"/>
       <w:tblStyleColBandSize w:val="1"/>
@@ -7956,9 +7403,6 @@
     <w:pPr>
       <w:spacing w:after="0" w:line="240" w:lineRule="auto"/>
     </w:pPr>
-    <w:rPr>
-      <w:rFonts w:ascii="Arial" w:hAnsi="Arial"/>
-    </w:rPr>
     <w:tblPr>
       <w:tblStyleRowBandSize w:val="1"/>
       <w:tblStyleColBandSize w:val="1"/>
@@ -8032,9 +7476,6 @@
     <w:pPr>
       <w:spacing w:after="0" w:line="240" w:lineRule="auto"/>
     </w:pPr>
-    <w:rPr>
-      <w:rFonts w:ascii="Arial" w:hAnsi="Arial"/>
-    </w:rPr>
     <w:tblPr>
       <w:tblStyleRowBandSize w:val="1"/>
       <w:tblStyleColBandSize w:val="1"/>
@@ -8108,9 +7549,6 @@
     <w:pPr>
       <w:spacing w:after="0" w:line="240" w:lineRule="auto"/>
     </w:pPr>
-    <w:rPr>
-      <w:rFonts w:ascii="Arial" w:hAnsi="Arial"/>
-    </w:rPr>
     <w:tblPr>
       <w:tblStyleRowBandSize w:val="1"/>
       <w:tblStyleColBandSize w:val="1"/>
@@ -8185,7 +7623,7 @@
       <w:spacing w:after="0" w:line="240" w:lineRule="auto"/>
     </w:pPr>
     <w:rPr>
-      <w:rFonts w:asciiTheme="majorHAnsi" w:eastAsiaTheme="majorEastAsia" w:hAnsiTheme="majorHAnsi" w:cstheme="majorBidi" w:ascii="Arial" w:hAnsi="Arial"/>
+      <w:rFonts w:asciiTheme="majorHAnsi" w:eastAsiaTheme="majorEastAsia" w:hAnsiTheme="majorHAnsi" w:cstheme="majorBidi"/>
       <w:color w:val="000000" w:themeColor="text1"/>
     </w:rPr>
     <w:tblPr>
@@ -8310,7 +7748,7 @@
       <w:spacing w:after="0" w:line="240" w:lineRule="auto"/>
     </w:pPr>
     <w:rPr>
-      <w:rFonts w:asciiTheme="majorHAnsi" w:eastAsiaTheme="majorEastAsia" w:hAnsiTheme="majorHAnsi" w:cstheme="majorBidi" w:ascii="Arial" w:hAnsi="Arial"/>
+      <w:rFonts w:asciiTheme="majorHAnsi" w:eastAsiaTheme="majorEastAsia" w:hAnsiTheme="majorHAnsi" w:cstheme="majorBidi"/>
       <w:color w:val="000000" w:themeColor="text1"/>
     </w:rPr>
     <w:tblPr>
@@ -8435,7 +7873,7 @@
       <w:spacing w:after="0" w:line="240" w:lineRule="auto"/>
     </w:pPr>
     <w:rPr>
-      <w:rFonts w:asciiTheme="majorHAnsi" w:eastAsiaTheme="majorEastAsia" w:hAnsiTheme="majorHAnsi" w:cstheme="majorBidi" w:ascii="Arial" w:hAnsi="Arial"/>
+      <w:rFonts w:asciiTheme="majorHAnsi" w:eastAsiaTheme="majorEastAsia" w:hAnsiTheme="majorHAnsi" w:cstheme="majorBidi"/>
       <w:color w:val="000000" w:themeColor="text1"/>
     </w:rPr>
     <w:tblPr>
@@ -8560,7 +7998,7 @@
       <w:spacing w:after="0" w:line="240" w:lineRule="auto"/>
     </w:pPr>
     <w:rPr>
-      <w:rFonts w:asciiTheme="majorHAnsi" w:eastAsiaTheme="majorEastAsia" w:hAnsiTheme="majorHAnsi" w:cstheme="majorBidi" w:ascii="Arial" w:hAnsi="Arial"/>
+      <w:rFonts w:asciiTheme="majorHAnsi" w:eastAsiaTheme="majorEastAsia" w:hAnsiTheme="majorHAnsi" w:cstheme="majorBidi"/>
       <w:color w:val="000000" w:themeColor="text1"/>
     </w:rPr>
     <w:tblPr>
@@ -8685,7 +8123,7 @@
       <w:spacing w:after="0" w:line="240" w:lineRule="auto"/>
     </w:pPr>
     <w:rPr>
-      <w:rFonts w:asciiTheme="majorHAnsi" w:eastAsiaTheme="majorEastAsia" w:hAnsiTheme="majorHAnsi" w:cstheme="majorBidi" w:ascii="Arial" w:hAnsi="Arial"/>
+      <w:rFonts w:asciiTheme="majorHAnsi" w:eastAsiaTheme="majorEastAsia" w:hAnsiTheme="majorHAnsi" w:cstheme="majorBidi"/>
       <w:color w:val="000000" w:themeColor="text1"/>
     </w:rPr>
     <w:tblPr>
@@ -8810,7 +8248,7 @@
       <w:spacing w:after="0" w:line="240" w:lineRule="auto"/>
     </w:pPr>
     <w:rPr>
-      <w:rFonts w:asciiTheme="majorHAnsi" w:eastAsiaTheme="majorEastAsia" w:hAnsiTheme="majorHAnsi" w:cstheme="majorBidi" w:ascii="Arial" w:hAnsi="Arial"/>
+      <w:rFonts w:asciiTheme="majorHAnsi" w:eastAsiaTheme="majorEastAsia" w:hAnsiTheme="majorHAnsi" w:cstheme="majorBidi"/>
       <w:color w:val="000000" w:themeColor="text1"/>
     </w:rPr>
     <w:tblPr>
@@ -8935,7 +8373,7 @@
       <w:spacing w:after="0" w:line="240" w:lineRule="auto"/>
     </w:pPr>
     <w:rPr>
-      <w:rFonts w:asciiTheme="majorHAnsi" w:eastAsiaTheme="majorEastAsia" w:hAnsiTheme="majorHAnsi" w:cstheme="majorBidi" w:ascii="Arial" w:hAnsi="Arial"/>
+      <w:rFonts w:asciiTheme="majorHAnsi" w:eastAsiaTheme="majorEastAsia" w:hAnsiTheme="majorHAnsi" w:cstheme="majorBidi"/>
       <w:color w:val="000000" w:themeColor="text1"/>
     </w:rPr>
     <w:tblPr>
@@ -9059,9 +8497,6 @@
     <w:pPr>
       <w:spacing w:after="0" w:line="240" w:lineRule="auto"/>
     </w:pPr>
-    <w:rPr>
-      <w:rFonts w:ascii="Arial" w:hAnsi="Arial"/>
-    </w:rPr>
     <w:tblPr>
       <w:tblStyleRowBandSize w:val="1"/>
       <w:tblStyleColBandSize w:val="1"/>
@@ -9203,9 +8638,6 @@
     <w:pPr>
       <w:spacing w:after="0" w:line="240" w:lineRule="auto"/>
     </w:pPr>
-    <w:rPr>
-      <w:rFonts w:ascii="Arial" w:hAnsi="Arial"/>
-    </w:rPr>
     <w:tblPr>
       <w:tblStyleRowBandSize w:val="1"/>
       <w:tblStyleColBandSize w:val="1"/>
@@ -9347,9 +8779,6 @@
     <w:pPr>
       <w:spacing w:after="0" w:line="240" w:lineRule="auto"/>
     </w:pPr>
-    <w:rPr>
-      <w:rFonts w:ascii="Arial" w:hAnsi="Arial"/>
-    </w:rPr>
     <w:tblPr>
       <w:tblStyleRowBandSize w:val="1"/>
       <w:tblStyleColBandSize w:val="1"/>
@@ -9491,9 +8920,6 @@
     <w:pPr>
       <w:spacing w:after="0" w:line="240" w:lineRule="auto"/>
     </w:pPr>
-    <w:rPr>
-      <w:rFonts w:ascii="Arial" w:hAnsi="Arial"/>
-    </w:rPr>
     <w:tblPr>
       <w:tblStyleRowBandSize w:val="1"/>
       <w:tblStyleColBandSize w:val="1"/>
@@ -9635,9 +9061,6 @@
     <w:pPr>
       <w:spacing w:after="0" w:line="240" w:lineRule="auto"/>
     </w:pPr>
-    <w:rPr>
-      <w:rFonts w:ascii="Arial" w:hAnsi="Arial"/>
-    </w:rPr>
     <w:tblPr>
       <w:tblStyleRowBandSize w:val="1"/>
       <w:tblStyleColBandSize w:val="1"/>
@@ -9779,9 +9202,6 @@
     <w:pPr>
       <w:spacing w:after="0" w:line="240" w:lineRule="auto"/>
     </w:pPr>
-    <w:rPr>
-      <w:rFonts w:ascii="Arial" w:hAnsi="Arial"/>
-    </w:rPr>
     <w:tblPr>
       <w:tblStyleRowBandSize w:val="1"/>
       <w:tblStyleColBandSize w:val="1"/>
@@ -9923,9 +9343,6 @@
     <w:pPr>
       <w:spacing w:after="0" w:line="240" w:lineRule="auto"/>
     </w:pPr>
-    <w:rPr>
-      <w:rFonts w:ascii="Arial" w:hAnsi="Arial"/>
-    </w:rPr>
     <w:tblPr>
       <w:tblStyleRowBandSize w:val="1"/>
       <w:tblStyleColBandSize w:val="1"/>
@@ -10068,7 +9485,6 @@
       <w:spacing w:after="0" w:line="240" w:lineRule="auto"/>
     </w:pPr>
     <w:rPr>
-      <w:rFonts w:ascii="Arial" w:hAnsi="Arial"/>
       <w:color w:val="FFFFFF" w:themeColor="background1"/>
     </w:rPr>
     <w:tblPr>
@@ -10183,7 +9599,6 @@
       <w:spacing w:after="0" w:line="240" w:lineRule="auto"/>
     </w:pPr>
     <w:rPr>
-      <w:rFonts w:ascii="Arial" w:hAnsi="Arial"/>
       <w:color w:val="FFFFFF" w:themeColor="background1"/>
     </w:rPr>
     <w:tblPr>
@@ -10298,7 +9713,6 @@
       <w:spacing w:after="0" w:line="240" w:lineRule="auto"/>
     </w:pPr>
     <w:rPr>
-      <w:rFonts w:ascii="Arial" w:hAnsi="Arial"/>
       <w:color w:val="FFFFFF" w:themeColor="background1"/>
     </w:rPr>
     <w:tblPr>
@@ -10413,7 +9827,6 @@
       <w:spacing w:after="0" w:line="240" w:lineRule="auto"/>
     </w:pPr>
     <w:rPr>
-      <w:rFonts w:ascii="Arial" w:hAnsi="Arial"/>
       <w:color w:val="FFFFFF" w:themeColor="background1"/>
     </w:rPr>
     <w:tblPr>
@@ -10528,7 +9941,6 @@
       <w:spacing w:after="0" w:line="240" w:lineRule="auto"/>
     </w:pPr>
     <w:rPr>
-      <w:rFonts w:ascii="Arial" w:hAnsi="Arial"/>
       <w:color w:val="FFFFFF" w:themeColor="background1"/>
     </w:rPr>
     <w:tblPr>
@@ -10643,7 +10055,6 @@
       <w:spacing w:after="0" w:line="240" w:lineRule="auto"/>
     </w:pPr>
     <w:rPr>
-      <w:rFonts w:ascii="Arial" w:hAnsi="Arial"/>
       <w:color w:val="FFFFFF" w:themeColor="background1"/>
     </w:rPr>
     <w:tblPr>
@@ -10758,7 +10169,6 @@
       <w:spacing w:after="0" w:line="240" w:lineRule="auto"/>
     </w:pPr>
     <w:rPr>
-      <w:rFonts w:ascii="Arial" w:hAnsi="Arial"/>
       <w:color w:val="FFFFFF" w:themeColor="background1"/>
     </w:rPr>
     <w:tblPr>
@@ -10873,7 +10283,6 @@
       <w:spacing w:after="0" w:line="240" w:lineRule="auto"/>
     </w:pPr>
     <w:rPr>
-      <w:rFonts w:ascii="Arial" w:hAnsi="Arial"/>
       <w:color w:val="000000" w:themeColor="text1"/>
     </w:rPr>
     <w:tblPr>
@@ -10996,7 +10405,6 @@
       <w:spacing w:after="0" w:line="240" w:lineRule="auto"/>
     </w:pPr>
     <w:rPr>
-      <w:rFonts w:ascii="Arial" w:hAnsi="Arial"/>
       <w:color w:val="000000" w:themeColor="text1"/>
     </w:rPr>
     <w:tblPr>
@@ -11119,7 +10527,6 @@
       <w:spacing w:after="0" w:line="240" w:lineRule="auto"/>
     </w:pPr>
     <w:rPr>
-      <w:rFonts w:ascii="Arial" w:hAnsi="Arial"/>
       <w:color w:val="000000" w:themeColor="text1"/>
     </w:rPr>
     <w:tblPr>
@@ -11242,7 +10649,6 @@
       <w:spacing w:after="0" w:line="240" w:lineRule="auto"/>
     </w:pPr>
     <w:rPr>
-      <w:rFonts w:ascii="Arial" w:hAnsi="Arial"/>
       <w:color w:val="000000" w:themeColor="text1"/>
     </w:rPr>
     <w:tblPr>
@@ -11355,7 +10761,6 @@
       <w:spacing w:after="0" w:line="240" w:lineRule="auto"/>
     </w:pPr>
     <w:rPr>
-      <w:rFonts w:ascii="Arial" w:hAnsi="Arial"/>
       <w:color w:val="000000" w:themeColor="text1"/>
     </w:rPr>
     <w:tblPr>
@@ -11478,7 +10883,6 @@
       <w:spacing w:after="0" w:line="240" w:lineRule="auto"/>
     </w:pPr>
     <w:rPr>
-      <w:rFonts w:ascii="Arial" w:hAnsi="Arial"/>
       <w:color w:val="000000" w:themeColor="text1"/>
     </w:rPr>
     <w:tblPr>
@@ -11601,7 +11005,6 @@
       <w:spacing w:after="0" w:line="240" w:lineRule="auto"/>
     </w:pPr>
     <w:rPr>
-      <w:rFonts w:ascii="Arial" w:hAnsi="Arial"/>
       <w:color w:val="000000" w:themeColor="text1"/>
     </w:rPr>
     <w:tblPr>
@@ -11724,7 +11127,6 @@
       <w:spacing w:after="0" w:line="240" w:lineRule="auto"/>
     </w:pPr>
     <w:rPr>
-      <w:rFonts w:ascii="Arial" w:hAnsi="Arial"/>
       <w:color w:val="000000" w:themeColor="text1"/>
     </w:rPr>
     <w:tblPr>
@@ -11811,7 +11213,6 @@
       <w:spacing w:after="0" w:line="240" w:lineRule="auto"/>
     </w:pPr>
     <w:rPr>
-      <w:rFonts w:ascii="Arial" w:hAnsi="Arial"/>
       <w:color w:val="000000" w:themeColor="text1"/>
     </w:rPr>
     <w:tblPr>
@@ -11898,7 +11299,6 @@
       <w:spacing w:after="0" w:line="240" w:lineRule="auto"/>
     </w:pPr>
     <w:rPr>
-      <w:rFonts w:ascii="Arial" w:hAnsi="Arial"/>
       <w:color w:val="000000" w:themeColor="text1"/>
     </w:rPr>
     <w:tblPr>
@@ -11985,7 +11385,6 @@
       <w:spacing w:after="0" w:line="240" w:lineRule="auto"/>
     </w:pPr>
     <w:rPr>
-      <w:rFonts w:ascii="Arial" w:hAnsi="Arial"/>
       <w:color w:val="000000" w:themeColor="text1"/>
     </w:rPr>
     <w:tblPr>
@@ -12072,7 +11471,6 @@
       <w:spacing w:after="0" w:line="240" w:lineRule="auto"/>
     </w:pPr>
     <w:rPr>
-      <w:rFonts w:ascii="Arial" w:hAnsi="Arial"/>
       <w:color w:val="000000" w:themeColor="text1"/>
     </w:rPr>
     <w:tblPr>
@@ -12159,7 +11557,6 @@
       <w:spacing w:after="0" w:line="240" w:lineRule="auto"/>
     </w:pPr>
     <w:rPr>
-      <w:rFonts w:ascii="Arial" w:hAnsi="Arial"/>
       <w:color w:val="000000" w:themeColor="text1"/>
     </w:rPr>
     <w:tblPr>
@@ -12246,7 +11643,6 @@
       <w:spacing w:after="0" w:line="240" w:lineRule="auto"/>
     </w:pPr>
     <w:rPr>
-      <w:rFonts w:ascii="Arial" w:hAnsi="Arial"/>
       <w:color w:val="000000" w:themeColor="text1"/>
     </w:rPr>
     <w:tblPr>
@@ -12333,7 +11729,6 @@
       <w:spacing w:after="0" w:line="240" w:lineRule="auto"/>
     </w:pPr>
     <w:rPr>
-      <w:rFonts w:ascii="Arial" w:hAnsi="Arial"/>
       <w:color w:val="000000" w:themeColor="text1"/>
     </w:rPr>
     <w:tblPr>
@@ -12414,7 +11809,6 @@
       <w:spacing w:after="0" w:line="240" w:lineRule="auto"/>
     </w:pPr>
     <w:rPr>
-      <w:rFonts w:ascii="Arial" w:hAnsi="Arial"/>
       <w:color w:val="000000" w:themeColor="text1"/>
     </w:rPr>
     <w:tblPr>
@@ -12495,7 +11889,6 @@
       <w:spacing w:after="0" w:line="240" w:lineRule="auto"/>
     </w:pPr>
     <w:rPr>
-      <w:rFonts w:ascii="Arial" w:hAnsi="Arial"/>
       <w:color w:val="000000" w:themeColor="text1"/>
     </w:rPr>
     <w:tblPr>
@@ -12576,7 +11969,6 @@
       <w:spacing w:after="0" w:line="240" w:lineRule="auto"/>
     </w:pPr>
     <w:rPr>
-      <w:rFonts w:ascii="Arial" w:hAnsi="Arial"/>
       <w:color w:val="000000" w:themeColor="text1"/>
     </w:rPr>
     <w:tblPr>
@@ -12657,7 +12049,6 @@
       <w:spacing w:after="0" w:line="240" w:lineRule="auto"/>
     </w:pPr>
     <w:rPr>
-      <w:rFonts w:ascii="Arial" w:hAnsi="Arial"/>
       <w:color w:val="000000" w:themeColor="text1"/>
     </w:rPr>
     <w:tblPr>
@@ -12738,7 +12129,6 @@
       <w:spacing w:after="0" w:line="240" w:lineRule="auto"/>
     </w:pPr>
     <w:rPr>
-      <w:rFonts w:ascii="Arial" w:hAnsi="Arial"/>
       <w:color w:val="000000" w:themeColor="text1"/>
     </w:rPr>
     <w:tblPr>
@@ -12819,7 +12209,6 @@
       <w:spacing w:after="0" w:line="240" w:lineRule="auto"/>
     </w:pPr>
     <w:rPr>
-      <w:rFonts w:ascii="Arial" w:hAnsi="Arial"/>
       <w:color w:val="000000" w:themeColor="text1"/>
     </w:rPr>
     <w:tblPr>

</xml_diff>

<commit_message>
Make proposal agent guide simpler
</commit_message>
<xml_diff>
--- a/Wooplix_Proposal_Agent_Guide.docx
+++ b/Wooplix_Proposal_Agent_Guide.docx
@@ -4,89 +4,84 @@
   <w:body>
     <w:p>
       <w:pPr>
-        <w:pStyle w:val="Title"/>
-        <w:spacing w:after="80"/>
+        <w:keepNext/>
+        <w:spacing w:before="0" w:after="40"/>
       </w:pPr>
       <w:r>
-        <w:t>What the Wooplix Proposal Agent Does</w:t>
+        <w:rPr>
+          <w:rFonts w:ascii="Calibri" w:hAnsi="Calibri"/>
+          <w:b/>
+          <w:color w:val="000000"/>
+          <w:sz w:val="36"/>
+        </w:rPr>
+        <w:t>Wooplix Proposal Agent</w:t>
       </w:r>
     </w:p>
     <w:p>
       <w:pPr>
-        <w:spacing w:after="160"/>
+        <w:spacing w:before="0" w:after="240"/>
       </w:pPr>
       <w:r>
         <w:rPr>
-          <w:rFonts w:ascii="Arial" w:hAnsi="Arial"/>
-          <w:color w:val="64748B"/>
+          <w:rFonts w:ascii="Calibri" w:hAnsi="Calibri"/>
+          <w:b w:val="0"/>
+          <w:color w:val="000000"/>
           <w:sz w:val="22"/>
         </w:rPr>
-        <w:t>A simple guide for the people who prepare and review Wooplix proposals</w:t>
-      </w:r>
-    </w:p>
-    <w:p>
-      <w:r>
-        <w:t>The Wooplix Proposal Agent turns a customer’s requirements into a first draft of a Wooplix proposal. It saves time preparing the document, while leaving the final review and approval to your team.</w:t>
+        <w:t>A short guide to what it does and how to use it</w:t>
       </w:r>
     </w:p>
     <w:p>
       <w:pPr>
-        <w:pStyle w:val="Heading1"/>
+        <w:spacing w:before="0" w:after="160"/>
       </w:pPr>
       <w:r>
-        <w:t>What you get</w:t>
+        <w:rPr>
+          <w:rFonts w:ascii="Calibri" w:hAnsi="Calibri"/>
+          <w:b w:val="0"/>
+          <w:color w:val="000000"/>
+        </w:rPr>
+        <w:t>We made this tool to help prepare a first draft of a client proposal. Add a customer requirement document and it creates a Wooplix proposal for the team to review.</w:t>
       </w:r>
     </w:p>
     <w:p>
       <w:pPr>
-        <w:pStyle w:val="ListBullet"/>
-        <w:spacing w:after="40"/>
+        <w:spacing w:before="40" w:after="60"/>
       </w:pPr>
       <w:r>
         <w:rPr>
+          <w:rFonts w:ascii="Calibri" w:hAnsi="Calibri"/>
           <w:b/>
+          <w:color w:val="000000"/>
+          <w:sz w:val="24"/>
         </w:rPr>
-        <w:t xml:space="preserve">An editable document — </w:t>
-      </w:r>
-      <w:r>
-        <w:t>Make changes in Word.</w:t>
+        <w:t>What it gives you</w:t>
       </w:r>
     </w:p>
     <w:p>
       <w:pPr>
-        <w:pStyle w:val="ListBullet"/>
-        <w:spacing w:after="40"/>
+        <w:spacing w:before="0" w:after="160"/>
       </w:pPr>
       <w:r>
         <w:rPr>
-          <w:b/>
+          <w:rFonts w:ascii="Calibri" w:hAnsi="Calibri"/>
+          <w:b w:val="0"/>
+          <w:color w:val="000000"/>
         </w:rPr>
-        <w:t xml:space="preserve">A PDF — </w:t>
-      </w:r>
-      <w:r>
-        <w:t>Share or print the proposal.</w:t>
+        <w:t>You get an editable Word file, a PDF, and a file with the proposal details. They come together in one download.</w:t>
       </w:r>
     </w:p>
     <w:p>
       <w:pPr>
-        <w:pStyle w:val="ListBullet"/>
-        <w:spacing w:after="40"/>
+        <w:spacing w:before="40" w:after="60"/>
       </w:pPr>
       <w:r>
         <w:rPr>
+          <w:rFonts w:ascii="Calibri" w:hAnsi="Calibri"/>
           <w:b/>
+          <w:color w:val="000000"/>
+          <w:sz w:val="24"/>
         </w:rPr>
-        <w:t xml:space="preserve">A data file — </w:t>
-      </w:r>
-      <w:r>
-        <w:t>A copy of the proposal details for reference.</w:t>
-      </w:r>
-    </w:p>
-    <w:p>
-      <w:pPr>
-        <w:pStyle w:val="Heading1"/>
-      </w:pPr>
-      <w:r>
         <w:t>How to use it</w:t>
       </w:r>
     </w:p>
@@ -94,138 +89,141 @@
       <w:pPr>
         <w:pStyle w:val="ListNumber"/>
         <w:spacing w:after="60"/>
+        <w:ind w:left="360"/>
       </w:pPr>
       <w:r>
-        <w:t>Open the proposal app using the link provided by your team.</w:t>
+        <w:rPr>
+          <w:rFonts w:ascii="Calibri" w:hAnsi="Calibri"/>
+          <w:color w:val="000000"/>
+          <w:sz w:val="22"/>
+        </w:rPr>
+        <w:t>Open the app using the link shared by your team.</w:t>
       </w:r>
     </w:p>
     <w:p>
       <w:pPr>
         <w:pStyle w:val="ListNumber"/>
         <w:spacing w:after="60"/>
+        <w:ind w:left="360"/>
       </w:pPr>
       <w:r>
-        <w:t>Choose a folder or select up to five requirement files. PDF, Word, text, and Markdown files are supported.</w:t>
+        <w:rPr>
+          <w:rFonts w:ascii="Calibri" w:hAnsi="Calibri"/>
+          <w:color w:val="000000"/>
+          <w:sz w:val="22"/>
+        </w:rPr>
+        <w:t>Choose a folder or select up to five requirement files. It accepts PDF, Word, text, and Markdown files.</w:t>
       </w:r>
     </w:p>
     <w:p>
       <w:pPr>
         <w:pStyle w:val="ListNumber"/>
         <w:spacing w:after="60"/>
+        <w:ind w:left="360"/>
       </w:pPr>
       <w:r>
-        <w:t>Select Generate proposals and wait for the download.</w:t>
+        <w:rPr>
+          <w:rFonts w:ascii="Calibri" w:hAnsi="Calibri"/>
+          <w:color w:val="000000"/>
+          <w:sz w:val="22"/>
+        </w:rPr>
+        <w:t>Click Generate proposals. When the download is ready, open the ZIP folder and review the proposal files.</w:t>
       </w:r>
     </w:p>
     <w:p>
       <w:pPr>
-        <w:pStyle w:val="ListNumber"/>
-        <w:spacing w:after="60"/>
+        <w:spacing w:before="160" w:after="60"/>
       </w:pPr>
       <w:r>
-        <w:t>Open the downloaded ZIP folder. Review each proposal and make any needed changes before sharing it.</w:t>
+        <w:rPr>
+          <w:rFonts w:ascii="Calibri" w:hAnsi="Calibri"/>
+          <w:b/>
+          <w:color w:val="000000"/>
+          <w:sz w:val="24"/>
+        </w:rPr>
+        <w:t>Putting it online</w:t>
       </w:r>
     </w:p>
     <w:p>
       <w:pPr>
-        <w:pStyle w:val="Heading1"/>
+        <w:spacing w:before="0" w:after="160"/>
       </w:pPr>
       <w:r>
-        <w:t>How it becomes available online</w:t>
+        <w:rPr>
+          <w:rFonts w:ascii="Calibri" w:hAnsi="Calibri"/>
+          <w:b w:val="0"/>
+          <w:color w:val="000000"/>
+        </w:rPr>
+        <w:t>The project owner puts the app on GitHub, connects it to Vercel, and adds the private key needed to create proposals. Vercel then provides a link that the owner can share with the team.</w:t>
       </w:r>
     </w:p>
     <w:p>
       <w:pPr>
-        <w:spacing w:after="120"/>
+        <w:spacing w:before="40" w:after="60"/>
       </w:pPr>
       <w:r>
-        <w:t>The project owner puts the app on GitHub, connects it to Vercel, and adds the private key the app needs to create proposals. Vercel then publishes the app and provides a web link. The owner can share that link with the intended users.</w:t>
-      </w:r>
-    </w:p>
-    <w:p>
-      <w:pPr>
-        <w:pStyle w:val="Heading1"/>
-      </w:pPr>
-      <w:r>
-        <w:t>A few things to remember</w:t>
+        <w:rPr>
+          <w:rFonts w:ascii="Calibri" w:hAnsi="Calibri"/>
+          <w:b/>
+          <w:color w:val="000000"/>
+          <w:sz w:val="24"/>
+        </w:rPr>
+        <w:t>Please remember</w:t>
       </w:r>
     </w:p>
     <w:p>
       <w:pPr>
         <w:pStyle w:val="ListBullet"/>
-        <w:spacing w:after="40"/>
+        <w:spacing w:after="60"/>
+        <w:ind w:left="360"/>
       </w:pPr>
       <w:r>
-        <w:t>Every proposal is a draft. Check names, details, scope, and commitments before sending it.</w:t>
+        <w:rPr>
+          <w:rFonts w:ascii="Calibri" w:hAnsi="Calibri"/>
+          <w:color w:val="000000"/>
+          <w:sz w:val="22"/>
+        </w:rPr>
+        <w:t>The proposal is only a draft. Check it before sending it to a customer.</w:t>
       </w:r>
     </w:p>
     <w:p>
       <w:pPr>
         <w:pStyle w:val="ListBullet"/>
-        <w:spacing w:after="40"/>
+        <w:spacing w:after="60"/>
+        <w:ind w:left="360"/>
       </w:pPr>
       <w:r>
-        <w:t>The requirements are sent to an AI service to prepare the draft. The app does not keep the uploaded files after processing.</w:t>
+        <w:rPr>
+          <w:rFonts w:ascii="Calibri" w:hAnsi="Calibri"/>
+          <w:color w:val="000000"/>
+          <w:sz w:val="22"/>
+        </w:rPr>
+        <w:t>The requirement is sent to an AI service to prepare the draft. The app does not keep the uploaded file after it is finished.</w:t>
       </w:r>
     </w:p>
     <w:p>
       <w:pPr>
         <w:pStyle w:val="ListBullet"/>
-        <w:spacing w:after="40"/>
+        <w:spacing w:after="60"/>
+        <w:ind w:left="360"/>
       </w:pPr>
       <w:r>
-        <w:t>Anyone with the app link can use it, so share the link only with the people who should have access.</w:t>
+        <w:rPr>
+          <w:rFonts w:ascii="Calibri" w:hAnsi="Calibri"/>
+          <w:color w:val="000000"/>
+          <w:sz w:val="22"/>
+        </w:rPr>
+        <w:t>Anyone with the app link can use it, so share the link only with the right people.</w:t>
       </w:r>
     </w:p>
     <w:sectPr>
-      <w:headerReference w:type="default" r:id="rId9"/>
-      <w:footerReference w:type="default" r:id="rId10"/>
       <w:pgSz w:w="12240" w:h="15840"/>
-      <w:pgMar w:top="893" w:right="1152" w:bottom="835" w:left="1152" w:header="720" w:footer="720" w:gutter="0"/>
+      <w:pgMar w:top="1008" w:right="1224" w:bottom="1008" w:left="1224" w:header="720" w:footer="720" w:gutter="0"/>
       <w:cols w:space="720"/>
       <w:docGrid w:linePitch="360"/>
     </w:sectPr>
   </w:body>
 </w:document>
-</file>
-
-<file path=word/footer1.xml><?xml version="1.0" encoding="utf-8"?>
-<w:ftr xmlns:m="http://schemas.openxmlformats.org/officeDocument/2006/math" xmlns:mc="http://schemas.openxmlformats.org/markup-compatibility/2006" xmlns:mo="http://schemas.microsoft.com/office/mac/office/2008/main" xmlns:mv="urn:schemas-microsoft-com:mac:vml" xmlns:o="urn:schemas-microsoft-com:office:office" xmlns:r="http://schemas.openxmlformats.org/officeDocument/2006/relationships" xmlns:v="urn:schemas-microsoft-com:vml" xmlns:w10="urn:schemas-microsoft-com:office:word" xmlns:w14="http://schemas.microsoft.com/office/word/2010/wordml" xmlns:w="http://schemas.openxmlformats.org/wordprocessingml/2006/main" xmlns:wne="http://schemas.microsoft.com/office/word/2006/wordml" xmlns:wp14="http://schemas.microsoft.com/office/word/2010/wordprocessingDrawing" xmlns:wp="http://schemas.openxmlformats.org/drawingml/2006/wordprocessingDrawing" xmlns:wpc="http://schemas.microsoft.com/office/word/2010/wordprocessingCanvas" xmlns:wpg="http://schemas.microsoft.com/office/word/2010/wordprocessingGroup" xmlns:wpi="http://schemas.microsoft.com/office/word/2010/wordprocessingInk" xmlns:wps="http://schemas.microsoft.com/office/word/2010/wordprocessingShape" mc:Ignorable="w14 wp14">
-  <w:p>
-    <w:pPr>
-      <w:pStyle w:val="Footer"/>
-      <w:jc w:val="center"/>
-    </w:pPr>
-    <w:r>
-      <w:rPr>
-        <w:rFonts w:ascii="Arial" w:hAnsi="Arial"/>
-        <w:color w:val="64748B"/>
-        <w:sz w:val="16"/>
-      </w:rPr>
-      <w:t>Wooplix Technologies Private Limited</w:t>
-    </w:r>
-  </w:p>
-</w:ftr>
-</file>
-
-<file path=word/header1.xml><?xml version="1.0" encoding="utf-8"?>
-<w:hdr xmlns:m="http://schemas.openxmlformats.org/officeDocument/2006/math" xmlns:mc="http://schemas.openxmlformats.org/markup-compatibility/2006" xmlns:mo="http://schemas.microsoft.com/office/mac/office/2008/main" xmlns:mv="urn:schemas-microsoft-com:mac:vml" xmlns:o="urn:schemas-microsoft-com:office:office" xmlns:r="http://schemas.openxmlformats.org/officeDocument/2006/relationships" xmlns:v="urn:schemas-microsoft-com:vml" xmlns:w10="urn:schemas-microsoft-com:office:word" xmlns:w14="http://schemas.microsoft.com/office/word/2010/wordml" xmlns:w="http://schemas.openxmlformats.org/wordprocessingml/2006/main" xmlns:wne="http://schemas.microsoft.com/office/word/2006/wordml" xmlns:wp14="http://schemas.microsoft.com/office/word/2010/wordprocessingDrawing" xmlns:wp="http://schemas.openxmlformats.org/drawingml/2006/wordprocessingDrawing" xmlns:wpc="http://schemas.microsoft.com/office/word/2010/wordprocessingCanvas" xmlns:wpg="http://schemas.microsoft.com/office/word/2010/wordprocessingGroup" xmlns:wpi="http://schemas.microsoft.com/office/word/2010/wordprocessingInk" xmlns:wps="http://schemas.microsoft.com/office/word/2010/wordprocessingShape" mc:Ignorable="w14 wp14">
-  <w:p>
-    <w:pPr>
-      <w:pStyle w:val="Header"/>
-      <w:jc w:val="right"/>
-    </w:pPr>
-    <w:r>
-      <w:rPr>
-        <w:rFonts w:ascii="Arial" w:hAnsi="Arial"/>
-        <w:b/>
-        <w:color w:val="315FCB"/>
-        <w:sz w:val="16"/>
-      </w:rPr>
-      <w:t>WOOPLIX  /  PROPOSAL AGENT</w:t>
-    </w:r>
-  </w:p>
-</w:hdr>
 </file>
 
 <file path=word/numbering.xml><?xml version="1.0" encoding="utf-8"?>
@@ -592,12 +590,12 @@
     <w:qFormat/>
     <w:rsid w:val="00FC693F"/>
     <w:pPr>
-      <w:spacing w:after="100" w:line="254" w:lineRule="auto"/>
+      <w:spacing w:after="100" w:line="252" w:lineRule="auto"/>
     </w:pPr>
     <w:rPr>
-      <w:rFonts w:ascii="Arial" w:hAnsi="Arial"/>
-      <w:color w:val="26364B"/>
-      <w:sz w:val="21"/>
+      <w:rFonts w:ascii="Calibri" w:hAnsi="Calibri"/>
+      <w:color w:val="000000"/>
+      <w:sz w:val="22"/>
     </w:rPr>
   </w:style>
   <w:style w:type="paragraph" w:styleId="Header">
@@ -655,14 +653,14 @@
     <w:pPr>
       <w:keepNext/>
       <w:keepLines/>
-      <w:spacing w:before="160" w:after="60"/>
+      <w:spacing w:before="480" w:after="0"/>
       <w:outlineLvl w:val="0"/>
     </w:pPr>
     <w:rPr>
-      <w:rFonts w:asciiTheme="majorHAnsi" w:eastAsiaTheme="majorEastAsia" w:hAnsiTheme="majorHAnsi" w:cstheme="majorBidi" w:ascii="Arial" w:hAnsi="Arial"/>
+      <w:rFonts w:asciiTheme="majorHAnsi" w:eastAsiaTheme="majorEastAsia" w:hAnsiTheme="majorHAnsi" w:cstheme="majorBidi"/>
       <w:b/>
       <w:bCs/>
-      <w:color w:val="172B4D"/>
+      <w:color w:val="365F91" w:themeColor="accent1" w:themeShade="BF"/>
       <w:sz w:val="28"/>
       <w:szCs w:val="28"/>
     </w:rPr>
@@ -679,15 +677,15 @@
     <w:pPr>
       <w:keepNext/>
       <w:keepLines/>
-      <w:spacing w:before="160" w:after="60"/>
+      <w:spacing w:before="200" w:after="0"/>
       <w:outlineLvl w:val="1"/>
     </w:pPr>
     <w:rPr>
-      <w:rFonts w:asciiTheme="majorHAnsi" w:eastAsiaTheme="majorEastAsia" w:hAnsiTheme="majorHAnsi" w:cstheme="majorBidi" w:ascii="Arial" w:hAnsi="Arial"/>
+      <w:rFonts w:asciiTheme="majorHAnsi" w:eastAsiaTheme="majorEastAsia" w:hAnsiTheme="majorHAnsi" w:cstheme="majorBidi"/>
       <w:b/>
       <w:bCs/>
-      <w:color w:val="315FCB"/>
-      <w:sz w:val="22"/>
+      <w:color w:val="4F81BD" w:themeColor="accent1"/>
+      <w:sz w:val="26"/>
       <w:szCs w:val="26"/>
     </w:rPr>
   </w:style>
@@ -941,16 +939,18 @@
     <w:qFormat/>
     <w:rsid w:val="00FC693F"/>
     <w:pPr>
-      <w:spacing w:after="60" w:line="240" w:lineRule="auto" w:before="160"/>
+      <w:pBdr>
+        <w:bottom w:val="single" w:sz="8" w:space="4" w:color="4F81BD" w:themeColor="accent1"/>
+      </w:pBdr>
+      <w:spacing w:after="300" w:line="240" w:lineRule="auto"/>
       <w:contextualSpacing/>
     </w:pPr>
     <w:rPr>
-      <w:rFonts w:asciiTheme="majorHAnsi" w:eastAsiaTheme="majorEastAsia" w:hAnsiTheme="majorHAnsi" w:cstheme="majorBidi" w:ascii="Arial" w:hAnsi="Arial"/>
-      <w:b/>
-      <w:color w:val="172B4D"/>
+      <w:rFonts w:asciiTheme="majorHAnsi" w:eastAsiaTheme="majorEastAsia" w:hAnsiTheme="majorHAnsi" w:cstheme="majorBidi"/>
+      <w:color w:val="17365D" w:themeColor="text2" w:themeShade="BF"/>
       <w:spacing w:val="5"/>
       <w:kern w:val="28"/>
-      <w:sz w:val="50"/>
+      <w:sz w:val="52"/>
       <w:szCs w:val="52"/>
     </w:rPr>
   </w:style>

</xml_diff>

<commit_message>
Enhance proposal formatting, add tables to scope and integrations, and categorize requirements/deliverables
</commit_message>
<xml_diff>
--- a/Wooplix_Proposal_Agent_Guide.docx
+++ b/Wooplix_Proposal_Agent_Guide.docx
@@ -151,11 +151,57 @@
       <w:r>
         <w:rPr>
           <w:rFonts w:ascii="Calibri" w:hAnsi="Calibri"/>
-          <w:b w:val="0"/>
           <w:color w:val="000000"/>
+          <w:sz w:val="22"/>
         </w:rPr>
-        <w:t>The project owner puts the app on GitHub, connects it to Vercel, and adds the private key needed to create proposals. Vercel then provides a link that the owner can share with the team.</w:t>
+        <w:t>The project owner keeps the project on GitHub and the app online with Vercel. Use these links:</w:t>
       </w:r>
+    </w:p>
+    <w:p>
+      <w:pPr>
+        <w:spacing w:after="60"/>
+      </w:pPr>
+      <w:r>
+        <w:rPr>
+          <w:rFonts w:ascii="Calibri" w:hAnsi="Calibri"/>
+          <w:sz w:val="22"/>
+        </w:rPr>
+        <w:t xml:space="preserve">Live app: </w:t>
+      </w:r>
+      <w:hyperlink r:id="rId9">
+        <w:r>
+          <w:rPr>
+            <w:rFonts w:ascii="Calibri" w:hAnsi="Calibri"/>
+            <w:color w:val="0563C1"/>
+            <w:u w:val="single"/>
+            <w:sz w:val="22"/>
+          </w:rPr>
+          <w:t>Open the proposal app</w:t>
+        </w:r>
+      </w:hyperlink>
+    </w:p>
+    <w:p>
+      <w:pPr>
+        <w:spacing w:after="100"/>
+      </w:pPr>
+      <w:r>
+        <w:rPr>
+          <w:rFonts w:ascii="Calibri" w:hAnsi="Calibri"/>
+          <w:sz w:val="22"/>
+        </w:rPr>
+        <w:t xml:space="preserve">Project files: </w:t>
+      </w:r>
+      <w:hyperlink r:id="rId10">
+        <w:r>
+          <w:rPr>
+            <w:rFonts w:ascii="Calibri" w:hAnsi="Calibri"/>
+            <w:color w:val="0563C1"/>
+            <w:u w:val="single"/>
+            <w:sz w:val="22"/>
+          </w:rPr>
+          <w:t>View the GitHub project</w:t>
+        </w:r>
+      </w:hyperlink>
     </w:p>
     <w:p>
       <w:pPr>

</xml_diff>

<commit_message>
Update system overview and architecture guide with professional styling and tables
</commit_message>
<xml_diff>
--- a/Wooplix_Proposal_Agent_Guide.docx
+++ b/Wooplix_Proposal_Agent_Guide.docx
@@ -2,274 +2,931 @@
 <file path=word/document.xml><?xml version="1.0" encoding="utf-8"?>
 <w:document xmlns:wpc="http://schemas.microsoft.com/office/word/2010/wordprocessingCanvas" xmlns:mo="http://schemas.microsoft.com/office/mac/office/2008/main" xmlns:mc="http://schemas.openxmlformats.org/markup-compatibility/2006" xmlns:mv="urn:schemas-microsoft-com:mac:vml" xmlns:o="urn:schemas-microsoft-com:office:office" xmlns:r="http://schemas.openxmlformats.org/officeDocument/2006/relationships" xmlns:m="http://schemas.openxmlformats.org/officeDocument/2006/math" xmlns:v="urn:schemas-microsoft-com:vml" xmlns:wp14="http://schemas.microsoft.com/office/word/2010/wordprocessingDrawing" xmlns:wp="http://schemas.openxmlformats.org/drawingml/2006/wordprocessingDrawing" xmlns:w10="urn:schemas-microsoft-com:office:word" xmlns:w="http://schemas.openxmlformats.org/wordprocessingml/2006/main" xmlns:w14="http://schemas.microsoft.com/office/word/2010/wordml" xmlns:wpg="http://schemas.microsoft.com/office/word/2010/wordprocessingGroup" xmlns:wpi="http://schemas.microsoft.com/office/word/2010/wordprocessingInk" xmlns:wne="http://schemas.microsoft.com/office/word/2006/wordml" xmlns:wps="http://schemas.microsoft.com/office/word/2010/wordprocessingShape" mc:Ignorable="w14 wp14">
   <w:body>
+    <w:tbl>
+      <w:tblPr>
+        <w:tblW w:type="auto" w:w="0"/>
+        <w:tblLook w:firstColumn="1" w:firstRow="1" w:lastColumn="0" w:lastRow="0" w:noHBand="0" w:noVBand="1" w:val="04A0"/>
+      </w:tblPr>
+      <w:tblGrid>
+        <w:gridCol w:w="3360"/>
+        <w:gridCol w:w="3360"/>
+        <w:gridCol w:w="3360"/>
+      </w:tblGrid>
+      <w:tr>
+        <w:tc>
+          <w:tcPr>
+            <w:tcW w:type="dxa" w:w="6048"/>
+          </w:tcPr>
+          <w:p>
+            <w:r>
+              <w:drawing>
+                <wp:inline xmlns:a="http://schemas.openxmlformats.org/drawingml/2006/main" xmlns:pic="http://schemas.openxmlformats.org/drawingml/2006/picture">
+                  <wp:extent cx="3108960" cy="910828"/>
+                  <wp:docPr id="1" name="Picture 1"/>
+                  <wp:cNvGraphicFramePr>
+                    <a:graphicFrameLocks noChangeAspect="1"/>
+                  </wp:cNvGraphicFramePr>
+                  <a:graphic>
+                    <a:graphicData uri="http://schemas.openxmlformats.org/drawingml/2006/picture">
+                      <pic:pic>
+                        <pic:nvPicPr>
+                          <pic:cNvPr id="0" name="wooplix_main_logo.png"/>
+                          <pic:cNvPicPr/>
+                        </pic:nvPicPr>
+                        <pic:blipFill>
+                          <a:blip r:embed="rId10"/>
+                          <a:stretch>
+                            <a:fillRect/>
+                          </a:stretch>
+                        </pic:blipFill>
+                        <pic:spPr>
+                          <a:xfrm>
+                            <a:off x="0" y="0"/>
+                            <a:ext cx="3108960" cy="910828"/>
+                          </a:xfrm>
+                          <a:prstGeom prst="rect"/>
+                        </pic:spPr>
+                      </pic:pic>
+                    </a:graphicData>
+                  </a:graphic>
+                </wp:inline>
+              </w:drawing>
+            </w:r>
+          </w:p>
+        </w:tc>
+        <w:tc>
+          <w:tcPr>
+            <w:tcW w:type="dxa" w:w="576"/>
+          </w:tcPr>
+          <w:p/>
+        </w:tc>
+        <w:tc>
+          <w:tcPr>
+            <w:tcW w:type="dxa" w:w="3456"/>
+          </w:tcPr>
+          <w:p>
+            <w:pPr>
+              <w:jc w:val="right"/>
+            </w:pPr>
+            <w:r>
+              <w:drawing>
+                <wp:inline xmlns:a="http://schemas.openxmlformats.org/drawingml/2006/main" xmlns:pic="http://schemas.openxmlformats.org/drawingml/2006/picture">
+                  <wp:extent cx="1737360" cy="189255"/>
+                  <wp:docPr id="2" name="Picture 2"/>
+                  <wp:cNvGraphicFramePr>
+                    <a:graphicFrameLocks noChangeAspect="1"/>
+                  </wp:cNvGraphicFramePr>
+                  <a:graphic>
+                    <a:graphicData uri="http://schemas.openxmlformats.org/drawingml/2006/picture">
+                      <pic:pic>
+                        <pic:nvPicPr>
+                          <pic:cNvPr id="0" name="wooplix_partner_badge.png"/>
+                          <pic:cNvPicPr/>
+                        </pic:nvPicPr>
+                        <pic:blipFill>
+                          <a:blip r:embed="rId11"/>
+                          <a:stretch>
+                            <a:fillRect/>
+                          </a:stretch>
+                        </pic:blipFill>
+                        <pic:spPr>
+                          <a:xfrm>
+                            <a:off x="0" y="0"/>
+                            <a:ext cx="1737360" cy="189255"/>
+                          </a:xfrm>
+                          <a:prstGeom prst="rect"/>
+                        </pic:spPr>
+                      </pic:pic>
+                    </a:graphicData>
+                  </a:graphic>
+                </wp:inline>
+              </w:drawing>
+            </w:r>
+          </w:p>
+        </w:tc>
+      </w:tr>
+    </w:tbl>
     <w:p>
       <w:pPr>
-        <w:keepNext/>
-        <w:spacing w:before="0" w:after="40"/>
+        <w:spacing w:before="160" w:after="40"/>
+      </w:pPr>
+    </w:p>
+    <w:tbl>
+      <w:tblPr>
+        <w:tblW w:type="auto" w:w="0"/>
+        <w:tblLook w:firstColumn="1" w:firstRow="1" w:lastColumn="0" w:lastRow="0" w:noHBand="0" w:noVBand="1" w:val="04A0"/>
+      </w:tblPr>
+      <w:tblGrid>
+        <w:gridCol w:w="10080"/>
+      </w:tblGrid>
+      <w:tr>
+        <w:tc>
+          <w:tcPr>
+            <w:tcW w:type="dxa" w:w="10080"/>
+            <w:shd w:fill="002B49"/>
+          </w:tcPr>
+          <w:p>
+            <w:pPr>
+              <w:spacing w:before="20" w:after="20"/>
+            </w:pPr>
+            <w:r>
+              <w:rPr>
+                <w:sz w:val="4"/>
+              </w:rPr>
+            </w:r>
+          </w:p>
+        </w:tc>
+      </w:tr>
+    </w:tbl>
+    <w:p>
+      <w:pPr>
+        <w:spacing w:before="280" w:after="40"/>
       </w:pPr>
       <w:r>
         <w:rPr>
-          <w:rFonts w:ascii="Calibri" w:hAnsi="Calibri"/>
           <w:b/>
-          <w:color w:val="000000"/>
-          <w:sz w:val="36"/>
+          <w:color w:val="002B49"/>
+          <w:sz w:val="40"/>
         </w:rPr>
         <w:t>Wooplix Proposal Agent</w:t>
       </w:r>
     </w:p>
     <w:p>
       <w:pPr>
-        <w:spacing w:before="0" w:after="240"/>
+        <w:spacing w:before="0" w:after="280"/>
       </w:pPr>
       <w:r>
         <w:rPr>
-          <w:rFonts w:ascii="Calibri" w:hAnsi="Calibri"/>
-          <w:b w:val="0"/>
-          <w:color w:val="000000"/>
+          <w:color w:val="64748B"/>
           <w:sz w:val="22"/>
         </w:rPr>
-        <w:t>A short guide to what it does and how to use it</w:t>
+        <w:t>System Overview &amp; Architecture Guide</w:t>
       </w:r>
     </w:p>
     <w:p>
       <w:pPr>
-        <w:spacing w:before="0" w:after="160"/>
+        <w:spacing w:before="280" w:after="80"/>
       </w:pPr>
       <w:r>
         <w:rPr>
-          <w:rFonts w:ascii="Calibri" w:hAnsi="Calibri"/>
-          <w:b w:val="0"/>
-          <w:color w:val="000000"/>
+          <w:b/>
+          <w:color w:val="002B49"/>
+          <w:sz w:val="25"/>
         </w:rPr>
-        <w:t>We made this tool to help prepare a first draft of a client proposal. Add a customer requirement document and it creates a Wooplix proposal for the team to review.</w:t>
+        <w:t>1. Purpose &amp; Overview</w:t>
+      </w:r>
+    </w:p>
+    <w:p>
+      <w:pPr>
+        <w:spacing w:after="120" w:line="288" w:lineRule="auto"/>
+      </w:pPr>
+      <w:r>
+        <w:rPr>
+          <w:color w:val="1E293B"/>
+          <w:sz w:val="19"/>
+        </w:rPr>
+        <w:t>The Wooplix Proposal Agent is an intelligent enterprise system designed to eliminate manual proposal drafting. It ingests unstructured client requirement documents (or raw meeting notes) and automatically transforms them into a polished, executive-ready proposal within seconds, adhering strictly to the official Wooplix branding guidelines.</w:t>
+      </w:r>
+    </w:p>
+    <w:p>
+      <w:pPr>
+        <w:spacing w:before="280" w:after="80"/>
+      </w:pPr>
+      <w:r>
+        <w:rPr>
+          <w:b/>
+          <w:color w:val="002B49"/>
+          <w:sz w:val="25"/>
+        </w:rPr>
+        <w:t>2. What It Delivers</w:t>
+      </w:r>
+    </w:p>
+    <w:p>
+      <w:pPr>
+        <w:spacing w:after="120" w:line="288" w:lineRule="auto"/>
+      </w:pPr>
+      <w:r>
+        <w:rPr>
+          <w:color w:val="1E293B"/>
+          <w:sz w:val="19"/>
+        </w:rPr>
+        <w:t>Every generation produces three synchronized deliverables packaged together:</w:t>
+      </w:r>
+    </w:p>
+    <w:tbl>
+      <w:tblPr>
+        <w:tblStyle w:val="TableGrid"/>
+        <w:tblW w:type="auto" w:w="0"/>
+        <w:tblLook w:firstColumn="1" w:firstRow="1" w:lastColumn="0" w:lastRow="0" w:noHBand="0" w:noVBand="1" w:val="04A0"/>
+        <w:tblCellMar>
+          <w:top w:w="80" w:type="dxa"/>
+          <w:bottom w:w="80" w:type="dxa"/>
+          <w:left w:w="120" w:type="dxa"/>
+          <w:right w:w="120" w:type="dxa"/>
+        </w:tblCellMar>
+        <w:tblBorders>
+          <w:top w:val="single" w:sz="4" w:space="0" w:color="b8c9d9"/>
+          <w:bottom w:val="single" w:sz="4" w:space="0" w:color="b8c9d9"/>
+          <w:left w:val="single" w:sz="4" w:space="0" w:color="b8c9d9"/>
+          <w:right w:val="single" w:sz="4" w:space="0" w:color="b8c9d9"/>
+          <w:insideH w:val="single" w:sz="4" w:space="0" w:color="b8c9d9"/>
+          <w:insideV w:val="single" w:sz="4" w:space="0" w:color="b8c9d9"/>
+        </w:tblBorders>
+      </w:tblPr>
+      <w:tblGrid>
+        <w:gridCol w:w="5040"/>
+        <w:gridCol w:w="5040"/>
+      </w:tblGrid>
+      <w:tr>
+        <w:tc>
+          <w:tcPr>
+            <w:tcW w:type="dxa" w:w="3312"/>
+            <w:shd w:fill="002B49"/>
+          </w:tcPr>
+          <w:p>
+            <w:r>
+              <w:rPr>
+                <w:b/>
+                <w:color w:val="FFFFFF"/>
+                <w:sz w:val="18"/>
+              </w:rPr>
+              <w:t>Deliverable</w:t>
+            </w:r>
+          </w:p>
+        </w:tc>
+        <w:tc>
+          <w:tcPr>
+            <w:tcW w:type="dxa" w:w="6768"/>
+            <w:shd w:fill="002B49"/>
+          </w:tcPr>
+          <w:p>
+            <w:r>
+              <w:rPr>
+                <w:b/>
+                <w:color w:val="FFFFFF"/>
+                <w:sz w:val="18"/>
+              </w:rPr>
+              <w:t>Format &amp; Features</w:t>
+            </w:r>
+          </w:p>
+        </w:tc>
+      </w:tr>
+      <w:tr>
+        <w:tc>
+          <w:tcPr>
+            <w:tcW w:type="dxa" w:w="3312"/>
+            <w:shd w:fill="edf3f8"/>
+          </w:tcPr>
+          <w:p>
+            <w:r>
+              <w:rPr>
+                <w:b/>
+                <w:color w:val="002B49"/>
+                <w:sz w:val="17"/>
+              </w:rPr>
+              <w:t>📄 Branded PDF Document</w:t>
+            </w:r>
+          </w:p>
+        </w:tc>
+        <w:tc>
+          <w:tcPr>
+            <w:tcW w:type="dxa" w:w="6768"/>
+            <w:shd w:fill="ffffff"/>
+          </w:tcPr>
+          <w:p>
+            <w:r>
+              <w:rPr>
+                <w:color w:val="1E293B"/>
+                <w:sz w:val="17"/>
+              </w:rPr>
+              <w:t>Ready for client presentation. Features official dual-logo header (Wooplix + Zoho Partner / NASSCOM), a 2-column executive cover sheet, full configuration matrix, timeline milestones, and clean footer.</w:t>
+            </w:r>
+          </w:p>
+        </w:tc>
+      </w:tr>
+      <w:tr>
+        <w:tc>
+          <w:tcPr>
+            <w:tcW w:type="dxa" w:w="3312"/>
+            <w:shd w:fill="f8fafc"/>
+          </w:tcPr>
+          <w:p>
+            <w:r>
+              <w:rPr>
+                <w:b/>
+                <w:color w:val="002B49"/>
+                <w:sz w:val="17"/>
+              </w:rPr>
+              <w:t>📝 Editable Word File (.docx)</w:t>
+            </w:r>
+          </w:p>
+        </w:tc>
+        <w:tc>
+          <w:tcPr>
+            <w:tcW w:type="dxa" w:w="6768"/>
+            <w:shd w:fill="ffffff"/>
+          </w:tcPr>
+          <w:p>
+            <w:r>
+              <w:rPr>
+                <w:color w:val="1E293B"/>
+                <w:sz w:val="17"/>
+              </w:rPr>
+              <w:t>Formatted in the Wooplix house style. Designed for sales consultants and solution architects to customize pricing, terms, or specific customer requirements.</w:t>
+            </w:r>
+          </w:p>
+        </w:tc>
+      </w:tr>
+      <w:tr>
+        <w:tc>
+          <w:tcPr>
+            <w:tcW w:type="dxa" w:w="3312"/>
+            <w:shd w:fill="edf3f8"/>
+          </w:tcPr>
+          <w:p>
+            <w:r>
+              <w:rPr>
+                <w:b/>
+                <w:color w:val="002B49"/>
+                <w:sz w:val="17"/>
+              </w:rPr>
+              <w:t>📦 Structured Proposal Data (.json)</w:t>
+            </w:r>
+          </w:p>
+        </w:tc>
+        <w:tc>
+          <w:tcPr>
+            <w:tcW w:type="dxa" w:w="6768"/>
+            <w:shd w:fill="ffffff"/>
+          </w:tcPr>
+          <w:p>
+            <w:r>
+              <w:rPr>
+                <w:color w:val="1E293B"/>
+                <w:sz w:val="17"/>
+              </w:rPr>
+              <w:t>Machine-readable JSON specification containing all extracted client parameters, module mappings, and timeline data for auditing and CRM synchronization.</w:t>
+            </w:r>
+          </w:p>
+        </w:tc>
+      </w:tr>
+    </w:tbl>
+    <w:p>
+      <w:pPr>
+        <w:spacing w:before="280" w:after="80"/>
+      </w:pPr>
+      <w:r>
+        <w:rPr>
+          <w:b/>
+          <w:color w:val="002B49"/>
+          <w:sz w:val="25"/>
+        </w:rPr>
+        <w:t>3. How to Use It (Step-by-Step)</w:t>
       </w:r>
     </w:p>
     <w:p>
       <w:pPr>
         <w:spacing w:before="40" w:after="60"/>
+        <w:ind w:left="288"/>
       </w:pPr>
       <w:r>
         <w:rPr>
-          <w:rFonts w:ascii="Calibri" w:hAnsi="Calibri"/>
           <w:b/>
-          <w:color w:val="000000"/>
-          <w:sz w:val="24"/>
+          <w:color w:val="002B49"/>
+          <w:sz w:val="18"/>
         </w:rPr>
-        <w:t>What it gives you</w:t>
+        <w:t xml:space="preserve">Step 1: Open the Portal: </w:t>
       </w:r>
-    </w:p>
-    <w:p>
-      <w:pPr>
-        <w:spacing w:before="0" w:after="160"/>
-      </w:pPr>
       <w:r>
         <w:rPr>
-          <w:rFonts w:ascii="Calibri" w:hAnsi="Calibri"/>
-          <w:b w:val="0"/>
-          <w:color w:val="000000"/>
+          <w:color w:val="1E293B"/>
+          <w:sz w:val="18"/>
         </w:rPr>
-        <w:t>You get an editable Word file, a PDF, and a file with the proposal details. They come together in one download.</w:t>
+        <w:t>Access the live application at https://proposal-six-kappa.vercel.app/ via your browser.</w:t>
       </w:r>
     </w:p>
     <w:p>
       <w:pPr>
         <w:spacing w:before="40" w:after="60"/>
+        <w:ind w:left="288"/>
       </w:pPr>
       <w:r>
         <w:rPr>
-          <w:rFonts w:ascii="Calibri" w:hAnsi="Calibri"/>
           <w:b/>
-          <w:color w:val="000000"/>
-          <w:sz w:val="24"/>
+          <w:color w:val="002B49"/>
+          <w:sz w:val="18"/>
         </w:rPr>
-        <w:t>How to use it</w:t>
+        <w:t xml:space="preserve">Step 2: Provide Requirements: </w:t>
+      </w:r>
+      <w:r>
+        <w:rPr>
+          <w:color w:val="1E293B"/>
+          <w:sz w:val="18"/>
+        </w:rPr>
+        <w:t>Either drag &amp; drop up to 5 requirement files (PDF, Word DOC/DOCX, TXT, or Markdown) or paste requirement notes into the text tab.</w:t>
       </w:r>
     </w:p>
     <w:p>
       <w:pPr>
-        <w:pStyle w:val="ListNumber"/>
-        <w:spacing w:after="60"/>
-        <w:ind w:left="360"/>
+        <w:spacing w:before="40" w:after="60"/>
+        <w:ind w:left="288"/>
       </w:pPr>
       <w:r>
         <w:rPr>
-          <w:rFonts w:ascii="Calibri" w:hAnsi="Calibri"/>
-          <w:color w:val="000000"/>
-          <w:sz w:val="22"/>
+          <w:b/>
+          <w:color w:val="002B49"/>
+          <w:sz w:val="18"/>
         </w:rPr>
-        <w:t>Open the app using the link shared by your team.</w:t>
+        <w:t xml:space="preserve">Step 3: Select Format &amp; Generate: </w:t>
+      </w:r>
+      <w:r>
+        <w:rPr>
+          <w:color w:val="1E293B"/>
+          <w:sz w:val="18"/>
+        </w:rPr>
+        <w:t>Choose your preferred download format (PDF Document, Word DOCX, or All Files ZIP) and click "Generate Proposal".</w:t>
       </w:r>
     </w:p>
     <w:p>
       <w:pPr>
-        <w:pStyle w:val="ListNumber"/>
-        <w:spacing w:after="60"/>
-        <w:ind w:left="360"/>
+        <w:spacing w:before="40" w:after="60"/>
+        <w:ind w:left="288"/>
       </w:pPr>
       <w:r>
         <w:rPr>
-          <w:rFonts w:ascii="Calibri" w:hAnsi="Calibri"/>
-          <w:color w:val="000000"/>
-          <w:sz w:val="22"/>
+          <w:b/>
+          <w:color w:val="002B49"/>
+          <w:sz w:val="18"/>
         </w:rPr>
-        <w:t>Choose a folder or select up to five requirement files. It accepts PDF, Word, text, and Markdown files.</w:t>
+        <w:t xml:space="preserve">Step 4: Review &amp; Finalize: </w:t>
+      </w:r>
+      <w:r>
+        <w:rPr>
+          <w:color w:val="1E293B"/>
+          <w:sz w:val="18"/>
+        </w:rPr>
+        <w:t>The generated proposal downloads automatically. Review the draft, verify client-specific commercials or assumptions, and proceed with client delivery.</w:t>
       </w:r>
     </w:p>
     <w:p>
       <w:pPr>
-        <w:pStyle w:val="ListNumber"/>
-        <w:spacing w:after="60"/>
-        <w:ind w:left="360"/>
+        <w:spacing w:before="280" w:after="80"/>
       </w:pPr>
       <w:r>
         <w:rPr>
-          <w:rFonts w:ascii="Calibri" w:hAnsi="Calibri"/>
-          <w:color w:val="000000"/>
-          <w:sz w:val="22"/>
+          <w:b/>
+          <w:color w:val="002B49"/>
+          <w:sz w:val="25"/>
         </w:rPr>
-        <w:t>Click Generate proposals. When the download is ready, open the ZIP folder and review the proposal files.</w:t>
+        <w:t>4. System Architecture Plan</w:t>
       </w:r>
     </w:p>
     <w:p>
       <w:pPr>
-        <w:spacing w:before="160" w:after="60"/>
+        <w:spacing w:after="120" w:line="288" w:lineRule="auto"/>
       </w:pPr>
       <w:r>
         <w:rPr>
-          <w:rFonts w:ascii="Calibri" w:hAnsi="Calibri"/>
+          <w:color w:val="1E293B"/>
+          <w:sz w:val="19"/>
+        </w:rPr>
+        <w:t>The system operates across four decoupled layers to ensure speed, accuracy, and enterprise document fidelity:</w:t>
+      </w:r>
+    </w:p>
+    <w:tbl>
+      <w:tblPr>
+        <w:tblStyle w:val="TableGrid"/>
+        <w:tblW w:type="auto" w:w="0"/>
+        <w:tblLook w:firstColumn="1" w:firstRow="1" w:lastColumn="0" w:lastRow="0" w:noHBand="0" w:noVBand="1" w:val="04A0"/>
+        <w:tblCellMar>
+          <w:top w:w="80" w:type="dxa"/>
+          <w:bottom w:w="80" w:type="dxa"/>
+          <w:left w:w="120" w:type="dxa"/>
+          <w:right w:w="120" w:type="dxa"/>
+        </w:tblCellMar>
+        <w:tblBorders>
+          <w:top w:val="single" w:sz="4" w:space="0" w:color="b8c9d9"/>
+          <w:bottom w:val="single" w:sz="4" w:space="0" w:color="b8c9d9"/>
+          <w:left w:val="single" w:sz="4" w:space="0" w:color="b8c9d9"/>
+          <w:right w:val="single" w:sz="4" w:space="0" w:color="b8c9d9"/>
+          <w:insideH w:val="single" w:sz="4" w:space="0" w:color="b8c9d9"/>
+          <w:insideV w:val="single" w:sz="4" w:space="0" w:color="b8c9d9"/>
+        </w:tblBorders>
+      </w:tblPr>
+      <w:tblGrid>
+        <w:gridCol w:w="3360"/>
+        <w:gridCol w:w="3360"/>
+        <w:gridCol w:w="3360"/>
+      </w:tblGrid>
+      <w:tr>
+        <w:tc>
+          <w:tcPr>
+            <w:tcW w:type="dxa" w:w="2592"/>
+            <w:shd w:fill="002B49"/>
+          </w:tcPr>
+          <w:p>
+            <w:r>
+              <w:rPr>
+                <w:b/>
+                <w:color w:val="FFFFFF"/>
+                <w:sz w:val="18"/>
+              </w:rPr>
+              <w:t>Architecture Layer</w:t>
+            </w:r>
+          </w:p>
+        </w:tc>
+        <w:tc>
+          <w:tcPr>
+            <w:tcW w:type="dxa" w:w="5184"/>
+            <w:shd w:fill="002B49"/>
+          </w:tcPr>
+          <w:p>
+            <w:r>
+              <w:rPr>
+                <w:b/>
+                <w:color w:val="FFFFFF"/>
+                <w:sz w:val="18"/>
+              </w:rPr>
+              <w:t>Core Functionality</w:t>
+            </w:r>
+          </w:p>
+        </w:tc>
+        <w:tc>
+          <w:tcPr>
+            <w:tcW w:type="dxa" w:w="2304"/>
+            <w:shd w:fill="002B49"/>
+          </w:tcPr>
+          <w:p>
+            <w:r>
+              <w:rPr>
+                <w:b/>
+                <w:color w:val="FFFFFF"/>
+                <w:sz w:val="18"/>
+              </w:rPr>
+              <w:t>Key Technologies</w:t>
+            </w:r>
+          </w:p>
+        </w:tc>
+      </w:tr>
+      <w:tr>
+        <w:tc>
+          <w:tcPr>
+            <w:tcW w:type="dxa" w:w="2592"/>
+            <w:shd w:fill="edf3f8"/>
+          </w:tcPr>
+          <w:p>
+            <w:r>
+              <w:rPr>
+                <w:b/>
+                <w:color w:val="002B49"/>
+                <w:sz w:val="17"/>
+              </w:rPr>
+              <w:t>1. Input &amp; Intake Layer</w:t>
+            </w:r>
+          </w:p>
+        </w:tc>
+        <w:tc>
+          <w:tcPr>
+            <w:tcW w:type="dxa" w:w="5184"/>
+            <w:shd w:fill="ffffff"/>
+          </w:tcPr>
+          <w:p>
+            <w:r>
+              <w:rPr>
+                <w:color w:val="1E293B"/>
+                <w:sz w:val="17"/>
+              </w:rPr>
+              <w:t>Extracts and sanitizes text from client documents across multiple formats without formatting artifacts.</w:t>
+            </w:r>
+          </w:p>
+        </w:tc>
+        <w:tc>
+          <w:tcPr>
+            <w:tcW w:type="dxa" w:w="2304"/>
+            <w:shd w:fill="edf3f8"/>
+          </w:tcPr>
+          <w:p>
+            <w:r>
+              <w:rPr>
+                <w:color w:val="475569"/>
+                <w:sz w:val="17"/>
+              </w:rPr>
+              <w:t>FastAPI, PyPDF, python-docx, HTML5 Drag &amp; Drop</w:t>
+            </w:r>
+          </w:p>
+        </w:tc>
+      </w:tr>
+      <w:tr>
+        <w:tc>
+          <w:tcPr>
+            <w:tcW w:type="dxa" w:w="2592"/>
+            <w:shd w:fill="ffffff"/>
+          </w:tcPr>
+          <w:p>
+            <w:r>
+              <w:rPr>
+                <w:b/>
+                <w:color w:val="002B49"/>
+                <w:sz w:val="17"/>
+              </w:rPr>
+              <w:t>2. AI &amp; Solution Engine</w:t>
+            </w:r>
+          </w:p>
+        </w:tc>
+        <w:tc>
+          <w:tcPr>
+            <w:tcW w:type="dxa" w:w="5184"/>
+            <w:shd w:fill="ffffff"/>
+          </w:tcPr>
+          <w:p>
+            <w:r>
+              <w:rPr>
+                <w:color w:val="1E293B"/>
+                <w:sz w:val="17"/>
+              </w:rPr>
+              <w:t>Analyzes client needs against Wooplix house standards and historical CRM precedents. Generates structured JSON with automated fallback resilience.</w:t>
+            </w:r>
+          </w:p>
+        </w:tc>
+        <w:tc>
+          <w:tcPr>
+            <w:tcW w:type="dxa" w:w="2304"/>
+            <w:shd w:fill="ffffff"/>
+          </w:tcPr>
+          <w:p>
+            <w:r>
+              <w:rPr>
+                <w:color w:val="475569"/>
+                <w:sz w:val="17"/>
+              </w:rPr>
+              <w:t>Groq High-Speed LLM (openai/gpt-oss-120b, fallback models), Zoho CRM API</w:t>
+            </w:r>
+          </w:p>
+        </w:tc>
+      </w:tr>
+      <w:tr>
+        <w:tc>
+          <w:tcPr>
+            <w:tcW w:type="dxa" w:w="2592"/>
+            <w:shd w:fill="edf3f8"/>
+          </w:tcPr>
+          <w:p>
+            <w:r>
+              <w:rPr>
+                <w:b/>
+                <w:color w:val="002B49"/>
+                <w:sz w:val="17"/>
+              </w:rPr>
+              <w:t>3. Document Generation</w:t>
+            </w:r>
+          </w:p>
+        </w:tc>
+        <w:tc>
+          <w:tcPr>
+            <w:tcW w:type="dxa" w:w="5184"/>
+            <w:shd w:fill="ffffff"/>
+          </w:tcPr>
+          <w:p>
+            <w:r>
+              <w:rPr>
+                <w:color w:val="1E293B"/>
+                <w:sz w:val="17"/>
+              </w:rPr>
+              <w:t>Converts structured JSON into branded executive PDF and Word files. Formats dual-logo headers, 2-column cover specs, and non-clipping footers.</w:t>
+            </w:r>
+          </w:p>
+        </w:tc>
+        <w:tc>
+          <w:tcPr>
+            <w:tcW w:type="dxa" w:w="2304"/>
+            <w:shd w:fill="edf3f8"/>
+          </w:tcPr>
+          <w:p>
+            <w:r>
+              <w:rPr>
+                <w:color w:val="475569"/>
+                <w:sz w:val="17"/>
+              </w:rPr>
+              <w:t>Dompdf (PHP Serverless), python-docx (OpenXML)</w:t>
+            </w:r>
+          </w:p>
+        </w:tc>
+      </w:tr>
+      <w:tr>
+        <w:tc>
+          <w:tcPr>
+            <w:tcW w:type="dxa" w:w="2592"/>
+            <w:shd w:fill="ffffff"/>
+          </w:tcPr>
+          <w:p>
+            <w:r>
+              <w:rPr>
+                <w:b/>
+                <w:color w:val="002B49"/>
+                <w:sz w:val="17"/>
+              </w:rPr>
+              <w:t>4. Delivery &amp; Hosting</w:t>
+            </w:r>
+          </w:p>
+        </w:tc>
+        <w:tc>
+          <w:tcPr>
+            <w:tcW w:type="dxa" w:w="5184"/>
+            <w:shd w:fill="ffffff"/>
+          </w:tcPr>
+          <w:p>
+            <w:r>
+              <w:rPr>
+                <w:color w:val="1E293B"/>
+                <w:sz w:val="17"/>
+              </w:rPr>
+              <w:t>Serverless deployment enabling zero-maintenance scalability, instant file delivery, and automated CI/CD deployment.</w:t>
+            </w:r>
+          </w:p>
+        </w:tc>
+        <w:tc>
+          <w:tcPr>
+            <w:tcW w:type="dxa" w:w="2304"/>
+            <w:shd w:fill="ffffff"/>
+          </w:tcPr>
+          <w:p>
+            <w:r>
+              <w:rPr>
+                <w:color w:val="475569"/>
+                <w:sz w:val="17"/>
+              </w:rPr>
+              <w:t>GitHub, Vercel Serverless Functions</w:t>
+            </w:r>
+          </w:p>
+        </w:tc>
+      </w:tr>
+    </w:tbl>
+    <w:p>
+      <w:pPr>
+        <w:spacing w:before="280" w:after="80"/>
+      </w:pPr>
+      <w:r>
+        <w:rPr>
           <w:b/>
-          <w:color w:val="000000"/>
-          <w:sz w:val="24"/>
+          <w:color w:val="002B49"/>
+          <w:sz w:val="25"/>
         </w:rPr>
-        <w:t>Putting it online</w:t>
+        <w:t>5. Governance &amp; Data Privacy</w:t>
       </w:r>
     </w:p>
     <w:p>
       <w:pPr>
-        <w:spacing w:before="0" w:after="160"/>
+        <w:spacing w:before="40" w:after="60"/>
+        <w:ind w:left="288"/>
       </w:pPr>
       <w:r>
         <w:rPr>
-          <w:rFonts w:ascii="Calibri" w:hAnsi="Calibri"/>
-          <w:color w:val="000000"/>
-          <w:sz w:val="22"/>
+          <w:b/>
+          <w:color w:val="002B49"/>
+          <w:sz w:val="18"/>
         </w:rPr>
-        <w:t>The project owner keeps the project on GitHub and the app online with Vercel. Use these links:</w:t>
+        <w:t xml:space="preserve">• Ephemeral Processing: </w:t>
+      </w:r>
+      <w:r>
+        <w:rPr>
+          <w:color w:val="1E293B"/>
+          <w:sz w:val="18"/>
+        </w:rPr>
+        <w:t>Uploaded customer documents and generated files are processed in-memory and temporary storage only. No customer data is retained on the server after download.</w:t>
       </w:r>
     </w:p>
     <w:p>
       <w:pPr>
-        <w:spacing w:after="60"/>
+        <w:spacing w:before="40" w:after="60"/>
+        <w:ind w:left="288"/>
       </w:pPr>
       <w:r>
         <w:rPr>
-          <w:rFonts w:ascii="Calibri" w:hAnsi="Calibri"/>
-          <w:sz w:val="22"/>
+          <w:b/>
+          <w:color w:val="002B49"/>
+          <w:sz w:val="18"/>
         </w:rPr>
-        <w:t xml:space="preserve">Live app: </w:t>
+        <w:t xml:space="preserve">• Human-in-the-Loop Review: </w:t>
       </w:r>
-      <w:hyperlink r:id="rId9">
-        <w:r>
-          <w:rPr>
-            <w:rFonts w:ascii="Calibri" w:hAnsi="Calibri"/>
-            <w:color w:val="0563C1"/>
-            <w:u w:val="single"/>
-            <w:sz w:val="22"/>
-          </w:rPr>
-          <w:t>Open the proposal app</w:t>
-        </w:r>
-      </w:hyperlink>
-    </w:p>
-    <w:p>
-      <w:pPr>
-        <w:spacing w:after="100"/>
-      </w:pPr>
       <w:r>
         <w:rPr>
-          <w:rFonts w:ascii="Calibri" w:hAnsi="Calibri"/>
-          <w:sz w:val="22"/>
+          <w:color w:val="1E293B"/>
+          <w:sz w:val="18"/>
         </w:rPr>
-        <w:t xml:space="preserve">Project files: </w:t>
+        <w:t>Proposals generated by the agent are baseline first drafts. Every proposal must be reviewed and approved by a qualified consultant before client transmission.</w:t>
       </w:r>
-      <w:hyperlink r:id="rId10">
-        <w:r>
-          <w:rPr>
-            <w:rFonts w:ascii="Calibri" w:hAnsi="Calibri"/>
-            <w:color w:val="0563C1"/>
-            <w:u w:val="single"/>
-            <w:sz w:val="22"/>
-          </w:rPr>
-          <w:t>View the GitHub project</w:t>
-        </w:r>
-      </w:hyperlink>
     </w:p>
     <w:p>
       <w:pPr>
         <w:spacing w:before="40" w:after="60"/>
+        <w:ind w:left="288"/>
       </w:pPr>
       <w:r>
         <w:rPr>
-          <w:rFonts w:ascii="Calibri" w:hAnsi="Calibri"/>
           <w:b/>
-          <w:color w:val="000000"/>
-          <w:sz w:val="24"/>
+          <w:color w:val="002B49"/>
+          <w:sz w:val="18"/>
         </w:rPr>
-        <w:t>Please remember</w:t>
+        <w:t xml:space="preserve">• Access Control: </w:t>
+      </w:r>
+      <w:r>
+        <w:rPr>
+          <w:color w:val="1E293B"/>
+          <w:sz w:val="18"/>
+        </w:rPr>
+        <w:t>Access to the web application is restricted to authorized team members.</w:t>
       </w:r>
     </w:p>
     <w:p>
       <w:pPr>
-        <w:pStyle w:val="ListBullet"/>
-        <w:spacing w:after="60"/>
-        <w:ind w:left="360"/>
+        <w:spacing w:before="280" w:after="80"/>
       </w:pPr>
       <w:r>
         <w:rPr>
-          <w:rFonts w:ascii="Calibri" w:hAnsi="Calibri"/>
-          <w:color w:val="000000"/>
-          <w:sz w:val="22"/>
+          <w:b/>
+          <w:color w:val="002B49"/>
+          <w:sz w:val="25"/>
         </w:rPr>
-        <w:t>The proposal is only a draft. Check it before sending it to a customer.</w:t>
+        <w:t>6. Access Links</w:t>
       </w:r>
     </w:p>
     <w:p>
       <w:pPr>
-        <w:pStyle w:val="ListBullet"/>
-        <w:spacing w:after="60"/>
-        <w:ind w:left="360"/>
+        <w:spacing w:after="80"/>
       </w:pPr>
       <w:r>
         <w:rPr>
-          <w:rFonts w:ascii="Calibri" w:hAnsi="Calibri"/>
-          <w:color w:val="000000"/>
-          <w:sz w:val="22"/>
+          <w:b/>
+          <w:color w:val="002B49"/>
+          <w:sz w:val="18"/>
         </w:rPr>
-        <w:t>The requirement is sent to an AI service to prepare the draft. The app does not keep the uploaded file after it is finished.</w:t>
+        <w:t xml:space="preserve">• Live Web Application: </w:t>
+      </w:r>
+      <w:r>
+        <w:rPr>
+          <w:color w:val="008080"/>
+          <w:sz w:val="18"/>
+          <w:u w:val="single"/>
+        </w:rPr>
+        <w:t>https://proposal-six-kappa.vercel.app/</w:t>
       </w:r>
     </w:p>
     <w:p>
       <w:pPr>
-        <w:pStyle w:val="ListBullet"/>
-        <w:spacing w:after="60"/>
-        <w:ind w:left="360"/>
+        <w:spacing w:after="120"/>
       </w:pPr>
       <w:r>
         <w:rPr>
-          <w:rFonts w:ascii="Calibri" w:hAnsi="Calibri"/>
-          <w:color w:val="000000"/>
-          <w:sz w:val="22"/>
+          <w:b/>
+          <w:color w:val="002B49"/>
+          <w:sz w:val="18"/>
         </w:rPr>
-        <w:t>Anyone with the app link can use it, so share the link only with the right people.</w:t>
+        <w:t xml:space="preserve">• Source Code Repository: </w:t>
+      </w:r>
+      <w:r>
+        <w:rPr>
+          <w:color w:val="008080"/>
+          <w:sz w:val="18"/>
+          <w:u w:val="single"/>
+        </w:rPr>
+        <w:t>https://github.com/wooplix15-debug/proposal</w:t>
       </w:r>
     </w:p>
     <w:sectPr>
+      <w:footerReference w:type="default" r:id="rId9"/>
       <w:pgSz w:w="12240" w:h="15840"/>
-      <w:pgMar w:top="1008" w:right="1224" w:bottom="1008" w:left="1224" w:header="720" w:footer="720" w:gutter="0"/>
+      <w:pgMar w:top="936" w:right="1080" w:bottom="936" w:left="1080" w:header="720" w:footer="720" w:gutter="0"/>
       <w:cols w:space="720"/>
       <w:docGrid w:linePitch="360"/>
     </w:sectPr>
   </w:body>
 </w:document>
+</file>
+
+<file path=word/footer1.xml><?xml version="1.0" encoding="utf-8"?>
+<w:ftr xmlns:m="http://schemas.openxmlformats.org/officeDocument/2006/math" xmlns:mc="http://schemas.openxmlformats.org/markup-compatibility/2006" xmlns:mo="http://schemas.microsoft.com/office/mac/office/2008/main" xmlns:mv="urn:schemas-microsoft-com:mac:vml" xmlns:o="urn:schemas-microsoft-com:office:office" xmlns:r="http://schemas.openxmlformats.org/officeDocument/2006/relationships" xmlns:v="urn:schemas-microsoft-com:vml" xmlns:w10="urn:schemas-microsoft-com:office:word" xmlns:w14="http://schemas.microsoft.com/office/word/2010/wordml" xmlns:w="http://schemas.openxmlformats.org/wordprocessingml/2006/main" xmlns:wne="http://schemas.microsoft.com/office/word/2006/wordml" xmlns:wp14="http://schemas.microsoft.com/office/word/2010/wordprocessingDrawing" xmlns:wp="http://schemas.openxmlformats.org/drawingml/2006/wordprocessingDrawing" xmlns:wpc="http://schemas.microsoft.com/office/word/2010/wordprocessingCanvas" xmlns:wpg="http://schemas.microsoft.com/office/word/2010/wordprocessingGroup" xmlns:wpi="http://schemas.microsoft.com/office/word/2010/wordprocessingInk" xmlns:wps="http://schemas.microsoft.com/office/word/2010/wordprocessingShape" mc:Ignorable="w14 wp14">
+  <w:p>
+    <w:pPr>
+      <w:pStyle w:val="Footer"/>
+      <w:spacing w:before="120"/>
+    </w:pPr>
+    <w:r>
+      <w:rPr>
+        <w:b/>
+        <w:color w:val="002B49"/>
+        <w:sz w:val="16"/>
+      </w:rPr>
+      <w:t>Wooplix Technologies Private Limited  •  Confidential</w:t>
+    </w:r>
+    <w:r>
+      <w:rPr>
+        <w:color w:val="64748B"/>
+        <w:sz w:val="16"/>
+      </w:rPr>
+      <w:t xml:space="preserve">    |    https://proposal-six-kappa.vercel.app/    |    www.wooplix.com</w:t>
+    </w:r>
+  </w:p>
+</w:ftr>
 </file>
 
 <file path=word/numbering.xml><?xml version="1.0" encoding="utf-8"?>
@@ -635,14 +1292,6 @@
     <w:name w:val="Normal"/>
     <w:qFormat/>
     <w:rsid w:val="00FC693F"/>
-    <w:pPr>
-      <w:spacing w:after="100" w:line="252" w:lineRule="auto"/>
-    </w:pPr>
-    <w:rPr>
-      <w:rFonts w:ascii="Calibri" w:hAnsi="Calibri"/>
-      <w:color w:val="000000"/>
-      <w:sz w:val="22"/>
-    </w:rPr>
   </w:style>
   <w:style w:type="paragraph" w:styleId="Header">
     <w:name w:val="header"/>

</xml_diff>